<commit_message>
Add API documentation PDF and README link
</commit_message>
<xml_diff>
--- a/docs/API_Documentation.docx
+++ b/docs/API_Documentation.docx
@@ -8,9 +8,6 @@
         <w:jc w:val="center"/>
       </w:pPr>
       <w:r>
-        <w:rPr>
-          <w:b/>
-        </w:rPr>
         <w:t>API Documentation</w:t>
       </w:r>
     </w:p>
@@ -20,81 +17,41 @@
       </w:pPr>
       <w:r>
         <w:rPr>
-          <w:i/>
+          <w:b/>
+          <w:sz w:val="22"/>
         </w:rPr>
         <w:t>COMP3011 Productivity API</w:t>
       </w:r>
     </w:p>
-    <w:p>
-      <w:pPr>
-        <w:jc w:val="center"/>
-      </w:pPr>
-      <w:r>
-        <w:rPr>
-          <w:i/>
-        </w:rPr>
-        <w:t>Prepared for coursework submission</w:t>
-      </w:r>
-    </w:p>
-    <w:p>
-      <w:pPr>
-        <w:pStyle w:val="Heading1"/>
-      </w:pPr>
-      <w:r>
-        <w:t>Project Overview</w:t>
-      </w:r>
-    </w:p>
-    <w:p>
-      <w:r>
-        <w:t>This API was built using Django and SQLite. It supports CRUD operations for habits and includes a simple analytics summary endpoint.</w:t>
-      </w:r>
-    </w:p>
     <w:tbl>
       <w:tblPr>
-        <w:tblStyle w:val="TableGrid"/>
         <w:tblW w:type="auto" w:w="0"/>
+        <w:jc w:val="center"/>
+        <w:tblLayout w:type="fixed"/>
         <w:tblLook w:firstColumn="1" w:firstRow="1" w:lastColumn="0" w:lastRow="0" w:noHBand="0" w:noVBand="1" w:val="04A0"/>
       </w:tblPr>
       <w:tblGrid>
-        <w:gridCol w:w="4824"/>
-        <w:gridCol w:w="4824"/>
+        <w:gridCol w:w="4968"/>
+        <w:gridCol w:w="4968"/>
       </w:tblGrid>
       <w:tr>
         <w:tc>
           <w:tcPr>
-            <w:tcW w:type="dxa" w:w="4824"/>
+            <w:tcW w:type="dxa" w:w="2448"/>
+            <w:shd w:fill="D9E2F3"/>
           </w:tcPr>
           <w:p>
             <w:r>
-              <w:t>Project</w:t>
+              <w:rPr>
+                <w:b/>
+              </w:rPr>
+              <w:t>API Root Prefix</w:t>
             </w:r>
           </w:p>
         </w:tc>
         <w:tc>
           <w:tcPr>
-            <w:tcW w:type="dxa" w:w="4824"/>
-          </w:tcPr>
-          <w:p>
-            <w:r>
-              <w:t>COMP3011 Productivity API</w:t>
-            </w:r>
-          </w:p>
-        </w:tc>
-      </w:tr>
-      <w:tr>
-        <w:tc>
-          <w:tcPr>
-            <w:tcW w:type="dxa" w:w="4824"/>
-          </w:tcPr>
-          <w:p>
-            <w:r>
-              <w:t>API root prefix</w:t>
-            </w:r>
-          </w:p>
-        </w:tc>
-        <w:tc>
-          <w:tcPr>
-            <w:tcW w:type="dxa" w:w="4824"/>
+            <w:tcW w:type="dxa" w:w="6912"/>
           </w:tcPr>
           <w:p>
             <w:r>
@@ -106,21 +63,51 @@
       <w:tr>
         <w:tc>
           <w:tcPr>
-            <w:tcW w:type="dxa" w:w="4824"/>
+            <w:tcW w:type="dxa" w:w="2448"/>
+            <w:shd w:fill="D9E2F3"/>
           </w:tcPr>
           <w:p>
             <w:r>
-              <w:t>Primary tools</w:t>
+              <w:rPr>
+                <w:b/>
+              </w:rPr>
+              <w:t>Stack</w:t>
             </w:r>
           </w:p>
         </w:tc>
         <w:tc>
           <w:tcPr>
-            <w:tcW w:type="dxa" w:w="4824"/>
+            <w:tcW w:type="dxa" w:w="6912"/>
           </w:tcPr>
           <w:p>
             <w:r>
-              <w:t>Python, Django, SQLite, Git, GitHub, Postman</w:t>
+              <w:t>Django, SQLite, Postman, GitHub</w:t>
+            </w:r>
+          </w:p>
+        </w:tc>
+      </w:tr>
+      <w:tr>
+        <w:tc>
+          <w:tcPr>
+            <w:tcW w:type="dxa" w:w="2448"/>
+            <w:shd w:fill="D9E2F3"/>
+          </w:tcPr>
+          <w:p>
+            <w:r>
+              <w:rPr>
+                <w:b/>
+              </w:rPr>
+              <w:t>Overview</w:t>
+            </w:r>
+          </w:p>
+        </w:tc>
+        <w:tc>
+          <w:tcPr>
+            <w:tcW w:type="dxa" w:w="6912"/>
+          </w:tcPr>
+          <w:p>
+            <w:r>
+              <w:t>Tracks habits, records completion logs, and provides simple productivity analytics.</w:t>
             </w:r>
           </w:p>
         </w:tc>
@@ -132,31 +119,54 @@
         <w:pStyle w:val="Heading1"/>
       </w:pPr>
       <w:r>
+        <w:t>Data Models</w:t>
+      </w:r>
+    </w:p>
+    <w:p>
+      <w:pPr>
+        <w:pStyle w:val="ListBullet"/>
+      </w:pPr>
+      <w:r>
+        <w:t>Habit: id, name, description, frequency, created_at</w:t>
+      </w:r>
+    </w:p>
+    <w:p>
+      <w:pPr>
+        <w:pStyle w:val="ListBullet"/>
+      </w:pPr>
+      <w:r>
+        <w:t>HabitLog: id, habit, completed_on, notes, created_at</w:t>
+      </w:r>
+    </w:p>
+    <w:p>
+      <w:pPr>
+        <w:pStyle w:val="Heading1"/>
+      </w:pPr>
+      <w:r>
         <w:t>1. Get All Habits</w:t>
       </w:r>
     </w:p>
     <w:tbl>
       <w:tblPr>
-        <w:tblStyle w:val="TableGrid"/>
         <w:tblW w:type="auto" w:w="0"/>
+        <w:jc w:val="center"/>
+        <w:tblLayout w:type="fixed"/>
         <w:tblLook w:firstColumn="1" w:firstRow="1" w:lastColumn="0" w:lastRow="0" w:noHBand="0" w:noVBand="1" w:val="04A0"/>
       </w:tblPr>
       <w:tblGrid>
-        <w:gridCol w:w="4824"/>
-        <w:gridCol w:w="4824"/>
+        <w:gridCol w:w="4968"/>
+        <w:gridCol w:w="4968"/>
       </w:tblGrid>
       <w:tr>
         <w:tc>
           <w:tcPr>
-            <w:tcW w:type="dxa" w:w="4824"/>
+            <w:tcW w:type="dxa" w:w="2016"/>
+            <w:shd w:fill="EAF1FB"/>
           </w:tcPr>
           <w:p>
-            <w:pPr>
-              <w:spacing w:after="0"/>
-            </w:pPr>
             <w:r>
               <w:rPr>
-                <w:sz w:val="20"/>
+                <w:b/>
               </w:rPr>
               <w:t>Method</w:t>
             </w:r>
@@ -164,16 +174,10 @@
         </w:tc>
         <w:tc>
           <w:tcPr>
-            <w:tcW w:type="dxa" w:w="4824"/>
+            <w:tcW w:type="dxa" w:w="7344"/>
           </w:tcPr>
           <w:p>
-            <w:pPr>
-              <w:spacing w:after="0"/>
-            </w:pPr>
             <w:r>
-              <w:rPr>
-                <w:sz w:val="20"/>
-              </w:rPr>
               <w:t>GET</w:t>
             </w:r>
           </w:p>
@@ -182,15 +186,13 @@
       <w:tr>
         <w:tc>
           <w:tcPr>
-            <w:tcW w:type="dxa" w:w="4824"/>
+            <w:tcW w:type="dxa" w:w="2016"/>
+            <w:shd w:fill="EAF1FB"/>
           </w:tcPr>
           <w:p>
-            <w:pPr>
-              <w:spacing w:after="0"/>
-            </w:pPr>
             <w:r>
               <w:rPr>
-                <w:sz w:val="20"/>
+                <w:b/>
               </w:rPr>
               <w:t>Endpoint</w:t>
             </w:r>
@@ -198,16 +200,10 @@
         </w:tc>
         <w:tc>
           <w:tcPr>
-            <w:tcW w:type="dxa" w:w="4824"/>
+            <w:tcW w:type="dxa" w:w="7344"/>
           </w:tcPr>
           <w:p>
-            <w:pPr>
-              <w:spacing w:after="0"/>
-            </w:pPr>
             <w:r>
-              <w:rPr>
-                <w:sz w:val="20"/>
-              </w:rPr>
               <w:t>/habits/</w:t>
             </w:r>
           </w:p>
@@ -216,15 +212,13 @@
       <w:tr>
         <w:tc>
           <w:tcPr>
-            <w:tcW w:type="dxa" w:w="4824"/>
+            <w:tcW w:type="dxa" w:w="2016"/>
+            <w:shd w:fill="EAF1FB"/>
           </w:tcPr>
           <w:p>
-            <w:pPr>
-              <w:spacing w:after="0"/>
-            </w:pPr>
             <w:r>
               <w:rPr>
-                <w:sz w:val="20"/>
+                <w:b/>
               </w:rPr>
               <w:t>Description</w:t>
             </w:r>
@@ -232,126 +226,98 @@
         </w:tc>
         <w:tc>
           <w:tcPr>
-            <w:tcW w:type="dxa" w:w="4824"/>
+            <w:tcW w:type="dxa" w:w="7344"/>
           </w:tcPr>
           <w:p>
-            <w:pPr>
-              <w:spacing w:after="0"/>
-            </w:pPr>
             <w:r>
-              <w:rPr>
-                <w:sz w:val="20"/>
-              </w:rPr>
               <w:t>Returns all habits stored in the database.</w:t>
             </w:r>
           </w:p>
         </w:tc>
       </w:tr>
+      <w:tr>
+        <w:tc>
+          <w:tcPr>
+            <w:tcW w:type="dxa" w:w="2016"/>
+            <w:shd w:fill="EAF1FB"/>
+          </w:tcPr>
+          <w:p>
+            <w:r>
+              <w:rPr>
+                <w:b/>
+              </w:rPr>
+              <w:t>Success</w:t>
+            </w:r>
+          </w:p>
+        </w:tc>
+        <w:tc>
+          <w:tcPr>
+            <w:tcW w:type="dxa" w:w="7344"/>
+          </w:tcPr>
+          <w:p>
+            <w:r>
+              <w:t>200 OK</w:t>
+            </w:r>
+          </w:p>
+        </w:tc>
+      </w:tr>
     </w:tbl>
-    <w:p/>
-    <w:p>
-      <w:r>
-        <w:rPr>
-          <w:b/>
-        </w:rPr>
-        <w:t xml:space="preserve">Status codes: </w:t>
-      </w:r>
-      <w:r>
-        <w:t>200 OK</w:t>
-      </w:r>
-    </w:p>
     <w:p>
       <w:pPr>
-        <w:pStyle w:val="Heading2"/>
+        <w:pStyle w:val="Heading3"/>
       </w:pPr>
       <w:r>
-        <w:t>Example Response</w:t>
+        <w:t>Example payload/response:</w:t>
       </w:r>
     </w:p>
     <w:tbl>
       <w:tblPr>
-        <w:tblStyle w:val="TableGrid"/>
         <w:tblW w:type="auto" w:w="0"/>
+        <w:jc w:val="center"/>
+        <w:tblLayout w:type="fixed"/>
         <w:tblLook w:firstColumn="1" w:firstRow="1" w:lastColumn="0" w:lastRow="0" w:noHBand="0" w:noVBand="1" w:val="04A0"/>
       </w:tblPr>
       <w:tblGrid>
-        <w:gridCol w:w="9648"/>
+        <w:gridCol w:w="9936"/>
       </w:tblGrid>
       <w:tr>
         <w:tc>
           <w:tcPr>
-            <w:tcW w:type="dxa" w:w="9648"/>
+            <w:tcW w:type="dxa" w:w="9360"/>
+            <w:vAlign w:val="center"/>
+            <w:shd w:fill="F3F6FA"/>
+            <w:tcBorders>
+              <w:top w:val="single" w:sz="4" w:color="D9E2F3"/>
+              <w:left w:val="single" w:sz="4" w:color="D9E2F3"/>
+              <w:bottom w:val="single" w:sz="4" w:color="D9E2F3"/>
+              <w:right w:val="single" w:sz="4" w:color="D9E2F3"/>
+            </w:tcBorders>
           </w:tcPr>
           <w:p>
+            <w:pPr>
+              <w:spacing w:before="60" w:after="60"/>
+            </w:pPr>
             <w:r>
               <w:rPr>
-                <w:rFonts w:ascii="Courier New" w:hAnsi="Courier New"/>
+                <w:rFonts w:ascii="Consolas" w:hAnsi="Consolas"/>
                 <w:sz w:val="18"/>
               </w:rPr>
               <w:t>[</w:t>
               <w:br/>
-            </w:r>
-            <w:r>
-              <w:rPr>
-                <w:rFonts w:ascii="Courier New" w:hAnsi="Courier New"/>
-                <w:sz w:val="18"/>
-              </w:rPr>
               <w:t xml:space="preserve">  {</w:t>
               <w:br/>
-            </w:r>
-            <w:r>
-              <w:rPr>
-                <w:rFonts w:ascii="Courier New" w:hAnsi="Courier New"/>
-                <w:sz w:val="18"/>
-              </w:rPr>
               <w:t xml:space="preserve">    "id": 1,</w:t>
               <w:br/>
-            </w:r>
-            <w:r>
-              <w:rPr>
-                <w:rFonts w:ascii="Courier New" w:hAnsi="Courier New"/>
-                <w:sz w:val="18"/>
-              </w:rPr>
               <w:t xml:space="preserve">    "name": "Drink More Water",</w:t>
               <w:br/>
-            </w:r>
-            <w:r>
-              <w:rPr>
-                <w:rFonts w:ascii="Courier New" w:hAnsi="Courier New"/>
-                <w:sz w:val="18"/>
-              </w:rPr>
               <w:t xml:space="preserve">    "description": "Drink 3 litres daily",</w:t>
               <w:br/>
-            </w:r>
-            <w:r>
-              <w:rPr>
-                <w:rFonts w:ascii="Courier New" w:hAnsi="Courier New"/>
-                <w:sz w:val="18"/>
-              </w:rPr>
               <w:t xml:space="preserve">    "frequency": "Daily",</w:t>
               <w:br/>
-            </w:r>
-            <w:r>
-              <w:rPr>
-                <w:rFonts w:ascii="Courier New" w:hAnsi="Courier New"/>
-                <w:sz w:val="18"/>
-              </w:rPr>
               <w:t xml:space="preserve">    "created_at": "2026-03-08T14:15:31.965Z"</w:t>
               <w:br/>
-            </w:r>
-            <w:r>
-              <w:rPr>
-                <w:rFonts w:ascii="Courier New" w:hAnsi="Courier New"/>
-                <w:sz w:val="18"/>
-              </w:rPr>
               <w:t xml:space="preserve">  }</w:t>
               <w:br/>
-            </w:r>
-            <w:r>
-              <w:rPr>
-                <w:rFonts w:ascii="Courier New" w:hAnsi="Courier New"/>
-                <w:sz w:val="18"/>
-              </w:rPr>
               <w:t>]</w:t>
             </w:r>
           </w:p>
@@ -369,26 +335,25 @@
     </w:p>
     <w:tbl>
       <w:tblPr>
-        <w:tblStyle w:val="TableGrid"/>
         <w:tblW w:type="auto" w:w="0"/>
+        <w:jc w:val="center"/>
+        <w:tblLayout w:type="fixed"/>
         <w:tblLook w:firstColumn="1" w:firstRow="1" w:lastColumn="0" w:lastRow="0" w:noHBand="0" w:noVBand="1" w:val="04A0"/>
       </w:tblPr>
       <w:tblGrid>
-        <w:gridCol w:w="4824"/>
-        <w:gridCol w:w="4824"/>
+        <w:gridCol w:w="4968"/>
+        <w:gridCol w:w="4968"/>
       </w:tblGrid>
       <w:tr>
         <w:tc>
           <w:tcPr>
-            <w:tcW w:type="dxa" w:w="4824"/>
+            <w:tcW w:type="dxa" w:w="2016"/>
+            <w:shd w:fill="EAF1FB"/>
           </w:tcPr>
           <w:p>
-            <w:pPr>
-              <w:spacing w:after="0"/>
-            </w:pPr>
             <w:r>
               <w:rPr>
-                <w:sz w:val="20"/>
+                <w:b/>
               </w:rPr>
               <w:t>Method</w:t>
             </w:r>
@@ -396,16 +361,10 @@
         </w:tc>
         <w:tc>
           <w:tcPr>
-            <w:tcW w:type="dxa" w:w="4824"/>
+            <w:tcW w:type="dxa" w:w="7344"/>
           </w:tcPr>
           <w:p>
-            <w:pPr>
-              <w:spacing w:after="0"/>
-            </w:pPr>
             <w:r>
-              <w:rPr>
-                <w:sz w:val="20"/>
-              </w:rPr>
               <w:t>GET</w:t>
             </w:r>
           </w:p>
@@ -414,15 +373,13 @@
       <w:tr>
         <w:tc>
           <w:tcPr>
-            <w:tcW w:type="dxa" w:w="4824"/>
+            <w:tcW w:type="dxa" w:w="2016"/>
+            <w:shd w:fill="EAF1FB"/>
           </w:tcPr>
           <w:p>
-            <w:pPr>
-              <w:spacing w:after="0"/>
-            </w:pPr>
             <w:r>
               <w:rPr>
-                <w:sz w:val="20"/>
+                <w:b/>
               </w:rPr>
               <w:t>Endpoint</w:t>
             </w:r>
@@ -430,16 +387,10 @@
         </w:tc>
         <w:tc>
           <w:tcPr>
-            <w:tcW w:type="dxa" w:w="4824"/>
+            <w:tcW w:type="dxa" w:w="7344"/>
           </w:tcPr>
           <w:p>
-            <w:pPr>
-              <w:spacing w:after="0"/>
-            </w:pPr>
             <w:r>
-              <w:rPr>
-                <w:sz w:val="20"/>
-              </w:rPr>
               <w:t>/habits/&lt;id&gt;/</w:t>
             </w:r>
           </w:p>
@@ -448,15 +399,13 @@
       <w:tr>
         <w:tc>
           <w:tcPr>
-            <w:tcW w:type="dxa" w:w="4824"/>
+            <w:tcW w:type="dxa" w:w="2016"/>
+            <w:shd w:fill="EAF1FB"/>
           </w:tcPr>
           <w:p>
-            <w:pPr>
-              <w:spacing w:after="0"/>
-            </w:pPr>
             <w:r>
               <w:rPr>
-                <w:sz w:val="20"/>
+                <w:b/>
               </w:rPr>
               <w:t>Description</w:t>
             </w:r>
@@ -464,78 +413,146 @@
         </w:tc>
         <w:tc>
           <w:tcPr>
-            <w:tcW w:type="dxa" w:w="4824"/>
+            <w:tcW w:type="dxa" w:w="7344"/>
           </w:tcPr>
           <w:p>
-            <w:pPr>
-              <w:spacing w:after="0"/>
-            </w:pPr>
             <w:r>
-              <w:rPr>
-                <w:sz w:val="20"/>
-              </w:rPr>
               <w:t>Returns a single habit by ID.</w:t>
             </w:r>
           </w:p>
         </w:tc>
       </w:tr>
+      <w:tr>
+        <w:tc>
+          <w:tcPr>
+            <w:tcW w:type="dxa" w:w="2016"/>
+            <w:shd w:fill="EAF1FB"/>
+          </w:tcPr>
+          <w:p>
+            <w:r>
+              <w:rPr>
+                <w:b/>
+              </w:rPr>
+              <w:t>Success</w:t>
+            </w:r>
+          </w:p>
+        </w:tc>
+        <w:tc>
+          <w:tcPr>
+            <w:tcW w:type="dxa" w:w="7344"/>
+          </w:tcPr>
+          <w:p>
+            <w:r>
+              <w:t>200 OK</w:t>
+            </w:r>
+          </w:p>
+        </w:tc>
+      </w:tr>
     </w:tbl>
-    <w:p/>
-    <w:p>
-      <w:r>
-        <w:rPr>
-          <w:b/>
-        </w:rPr>
-        <w:t xml:space="preserve">Status codes: </w:t>
-      </w:r>
-      <w:r>
-        <w:t>200 OK, 404 Not Found</w:t>
-      </w:r>
-    </w:p>
     <w:p>
       <w:pPr>
-        <w:pStyle w:val="Heading2"/>
+        <w:pStyle w:val="Heading3"/>
       </w:pPr>
       <w:r>
-        <w:t>Example Response</w:t>
+        <w:t>Example payload/response:</w:t>
       </w:r>
     </w:p>
     <w:tbl>
       <w:tblPr>
-        <w:tblStyle w:val="TableGrid"/>
         <w:tblW w:type="auto" w:w="0"/>
+        <w:jc w:val="center"/>
+        <w:tblLayout w:type="fixed"/>
         <w:tblLook w:firstColumn="1" w:firstRow="1" w:lastColumn="0" w:lastRow="0" w:noHBand="0" w:noVBand="1" w:val="04A0"/>
       </w:tblPr>
       <w:tblGrid>
-        <w:gridCol w:w="9648"/>
+        <w:gridCol w:w="9936"/>
       </w:tblGrid>
       <w:tr>
         <w:tc>
           <w:tcPr>
-            <w:tcW w:type="dxa" w:w="9648"/>
+            <w:tcW w:type="dxa" w:w="9360"/>
+            <w:vAlign w:val="center"/>
+            <w:shd w:fill="F3F6FA"/>
+            <w:tcBorders>
+              <w:top w:val="single" w:sz="4" w:color="D9E2F3"/>
+              <w:left w:val="single" w:sz="4" w:color="D9E2F3"/>
+              <w:bottom w:val="single" w:sz="4" w:color="D9E2F3"/>
+              <w:right w:val="single" w:sz="4" w:color="D9E2F3"/>
+            </w:tcBorders>
           </w:tcPr>
           <w:p>
+            <w:pPr>
+              <w:spacing w:before="60" w:after="60"/>
+            </w:pPr>
             <w:r>
               <w:rPr>
-                <w:rFonts w:ascii="Courier New" w:hAnsi="Courier New"/>
+                <w:rFonts w:ascii="Consolas" w:hAnsi="Consolas"/>
                 <w:sz w:val="18"/>
               </w:rPr>
               <w:t>{</w:t>
               <w:br/>
+              <w:t xml:space="preserve">  "id": 1,</w:t>
+              <w:br/>
+              <w:t xml:space="preserve">  "name": "Drink More Water",</w:t>
+              <w:br/>
+              <w:t xml:space="preserve">  "description": "Drink 3 litres daily",</w:t>
+              <w:br/>
+              <w:t xml:space="preserve">  "frequency": "Daily",</w:t>
+              <w:br/>
+              <w:t xml:space="preserve">  "created_at": "2026-03-08T14:15:31.965Z"</w:t>
+              <w:br/>
+              <w:t>}</w:t>
             </w:r>
+          </w:p>
+        </w:tc>
+      </w:tr>
+    </w:tbl>
+    <w:p>
+      <w:pPr>
+        <w:pStyle w:val="Heading3"/>
+      </w:pPr>
+      <w:r>
+        <w:t>Possible error responses:</w:t>
+      </w:r>
+    </w:p>
+    <w:tbl>
+      <w:tblPr>
+        <w:tblW w:type="auto" w:w="0"/>
+        <w:jc w:val="center"/>
+        <w:tblLayout w:type="fixed"/>
+        <w:tblLook w:firstColumn="1" w:firstRow="1" w:lastColumn="0" w:lastRow="0" w:noHBand="0" w:noVBand="1" w:val="04A0"/>
+      </w:tblPr>
+      <w:tblGrid>
+        <w:gridCol w:w="9936"/>
+      </w:tblGrid>
+      <w:tr>
+        <w:tc>
+          <w:tcPr>
+            <w:tcW w:type="dxa" w:w="9360"/>
+            <w:vAlign w:val="center"/>
+            <w:shd w:fill="F3F6FA"/>
+            <w:tcBorders>
+              <w:top w:val="single" w:sz="4" w:color="D9E2F3"/>
+              <w:left w:val="single" w:sz="4" w:color="D9E2F3"/>
+              <w:bottom w:val="single" w:sz="4" w:color="D9E2F3"/>
+              <w:right w:val="single" w:sz="4" w:color="D9E2F3"/>
+            </w:tcBorders>
+          </w:tcPr>
+          <w:p>
+            <w:pPr>
+              <w:spacing w:before="60" w:after="60"/>
+            </w:pPr>
             <w:r>
               <w:rPr>
-                <w:rFonts w:ascii="Courier New" w:hAnsi="Courier New"/>
+                <w:rFonts w:ascii="Consolas" w:hAnsi="Consolas"/>
                 <w:sz w:val="18"/>
               </w:rPr>
+              <w:t>404 Not Found</w:t>
+              <w:br/>
+              <w:t>{</w:t>
+              <w:br/>
               <w:t xml:space="preserve">  "error": "Habit not found"</w:t>
               <w:br/>
-            </w:r>
-            <w:r>
-              <w:rPr>
-                <w:rFonts w:ascii="Courier New" w:hAnsi="Courier New"/>
-                <w:sz w:val="18"/>
-              </w:rPr>
               <w:t>}</w:t>
             </w:r>
           </w:p>
@@ -553,26 +570,25 @@
     </w:p>
     <w:tbl>
       <w:tblPr>
-        <w:tblStyle w:val="TableGrid"/>
         <w:tblW w:type="auto" w:w="0"/>
+        <w:jc w:val="center"/>
+        <w:tblLayout w:type="fixed"/>
         <w:tblLook w:firstColumn="1" w:firstRow="1" w:lastColumn="0" w:lastRow="0" w:noHBand="0" w:noVBand="1" w:val="04A0"/>
       </w:tblPr>
       <w:tblGrid>
-        <w:gridCol w:w="4824"/>
-        <w:gridCol w:w="4824"/>
+        <w:gridCol w:w="4968"/>
+        <w:gridCol w:w="4968"/>
       </w:tblGrid>
       <w:tr>
         <w:tc>
           <w:tcPr>
-            <w:tcW w:type="dxa" w:w="4824"/>
+            <w:tcW w:type="dxa" w:w="2016"/>
+            <w:shd w:fill="EAF1FB"/>
           </w:tcPr>
           <w:p>
-            <w:pPr>
-              <w:spacing w:after="0"/>
-            </w:pPr>
             <w:r>
               <w:rPr>
-                <w:sz w:val="20"/>
+                <w:b/>
               </w:rPr>
               <w:t>Method</w:t>
             </w:r>
@@ -580,16 +596,10 @@
         </w:tc>
         <w:tc>
           <w:tcPr>
-            <w:tcW w:type="dxa" w:w="4824"/>
+            <w:tcW w:type="dxa" w:w="7344"/>
           </w:tcPr>
           <w:p>
-            <w:pPr>
-              <w:spacing w:after="0"/>
-            </w:pPr>
             <w:r>
-              <w:rPr>
-                <w:sz w:val="20"/>
-              </w:rPr>
               <w:t>POST</w:t>
             </w:r>
           </w:p>
@@ -598,15 +608,13 @@
       <w:tr>
         <w:tc>
           <w:tcPr>
-            <w:tcW w:type="dxa" w:w="4824"/>
+            <w:tcW w:type="dxa" w:w="2016"/>
+            <w:shd w:fill="EAF1FB"/>
           </w:tcPr>
           <w:p>
-            <w:pPr>
-              <w:spacing w:after="0"/>
-            </w:pPr>
             <w:r>
               <w:rPr>
-                <w:sz w:val="20"/>
+                <w:b/>
               </w:rPr>
               <w:t>Endpoint</w:t>
             </w:r>
@@ -614,16 +622,10 @@
         </w:tc>
         <w:tc>
           <w:tcPr>
-            <w:tcW w:type="dxa" w:w="4824"/>
+            <w:tcW w:type="dxa" w:w="7344"/>
           </w:tcPr>
           <w:p>
-            <w:pPr>
-              <w:spacing w:after="0"/>
-            </w:pPr>
             <w:r>
-              <w:rPr>
-                <w:sz w:val="20"/>
-              </w:rPr>
               <w:t>/habits/create/</w:t>
             </w:r>
           </w:p>
@@ -632,15 +634,13 @@
       <w:tr>
         <w:tc>
           <w:tcPr>
-            <w:tcW w:type="dxa" w:w="4824"/>
+            <w:tcW w:type="dxa" w:w="2016"/>
+            <w:shd w:fill="EAF1FB"/>
           </w:tcPr>
           <w:p>
-            <w:pPr>
-              <w:spacing w:after="0"/>
-            </w:pPr>
             <w:r>
               <w:rPr>
-                <w:sz w:val="20"/>
+                <w:b/>
               </w:rPr>
               <w:t>Description</w:t>
             </w:r>
@@ -648,218 +648,171 @@
         </w:tc>
         <w:tc>
           <w:tcPr>
-            <w:tcW w:type="dxa" w:w="4824"/>
+            <w:tcW w:type="dxa" w:w="7344"/>
           </w:tcPr>
           <w:p>
-            <w:pPr>
-              <w:spacing w:after="0"/>
-            </w:pPr>
             <w:r>
-              <w:rPr>
-                <w:sz w:val="20"/>
-              </w:rPr>
               <w:t>Creates a new habit in the database.</w:t>
             </w:r>
           </w:p>
         </w:tc>
       </w:tr>
+      <w:tr>
+        <w:tc>
+          <w:tcPr>
+            <w:tcW w:type="dxa" w:w="2016"/>
+            <w:shd w:fill="EAF1FB"/>
+          </w:tcPr>
+          <w:p>
+            <w:r>
+              <w:rPr>
+                <w:b/>
+              </w:rPr>
+              <w:t>Success</w:t>
+            </w:r>
+          </w:p>
+        </w:tc>
+        <w:tc>
+          <w:tcPr>
+            <w:tcW w:type="dxa" w:w="7344"/>
+          </w:tcPr>
+          <w:p>
+            <w:r>
+              <w:t>201 Created</w:t>
+            </w:r>
+          </w:p>
+        </w:tc>
+      </w:tr>
     </w:tbl>
-    <w:p/>
     <w:p>
       <w:r>
         <w:rPr>
           <w:b/>
         </w:rPr>
-        <w:t xml:space="preserve">Status codes: </w:t>
+        <w:t xml:space="preserve">Allowed frequency values: </w:t>
       </w:r>
       <w:r>
-        <w:t>201 Created, 400 Bad Request, 405 Method Not Allowed</w:t>
+        <w:t>Daily, Weekly</w:t>
       </w:r>
     </w:p>
     <w:p>
       <w:pPr>
-        <w:pStyle w:val="Heading2"/>
+        <w:pStyle w:val="Heading3"/>
       </w:pPr>
       <w:r>
-        <w:t>Request / Response Examples</w:t>
-      </w:r>
-    </w:p>
-    <w:p>
-      <w:r>
-        <w:rPr>
-          <w:b/>
-        </w:rPr>
-        <w:t xml:space="preserve">Required fields: </w:t>
-      </w:r>
-      <w:r>
-        <w:t>name, frequency</w:t>
-      </w:r>
-    </w:p>
-    <w:p>
-      <w:r>
-        <w:rPr>
-          <w:b/>
-        </w:rPr>
-        <w:t xml:space="preserve">Optional field: </w:t>
-      </w:r>
-      <w:r>
-        <w:t>description</w:t>
+        <w:t>Example payload/response:</w:t>
       </w:r>
     </w:p>
     <w:tbl>
       <w:tblPr>
-        <w:tblStyle w:val="TableGrid"/>
         <w:tblW w:type="auto" w:w="0"/>
+        <w:jc w:val="center"/>
+        <w:tblLayout w:type="fixed"/>
         <w:tblLook w:firstColumn="1" w:firstRow="1" w:lastColumn="0" w:lastRow="0" w:noHBand="0" w:noVBand="1" w:val="04A0"/>
       </w:tblPr>
       <w:tblGrid>
-        <w:gridCol w:w="9648"/>
+        <w:gridCol w:w="9936"/>
       </w:tblGrid>
       <w:tr>
         <w:tc>
           <w:tcPr>
-            <w:tcW w:type="dxa" w:w="9648"/>
+            <w:tcW w:type="dxa" w:w="9360"/>
+            <w:vAlign w:val="center"/>
+            <w:shd w:fill="F3F6FA"/>
+            <w:tcBorders>
+              <w:top w:val="single" w:sz="4" w:color="D9E2F3"/>
+              <w:left w:val="single" w:sz="4" w:color="D9E2F3"/>
+              <w:bottom w:val="single" w:sz="4" w:color="D9E2F3"/>
+              <w:right w:val="single" w:sz="4" w:color="D9E2F3"/>
+            </w:tcBorders>
           </w:tcPr>
           <w:p>
+            <w:pPr>
+              <w:spacing w:before="60" w:after="60"/>
+            </w:pPr>
             <w:r>
               <w:rPr>
-                <w:rFonts w:ascii="Courier New" w:hAnsi="Courier New"/>
+                <w:rFonts w:ascii="Consolas" w:hAnsi="Consolas"/>
                 <w:sz w:val="18"/>
               </w:rPr>
               <w:t>{</w:t>
               <w:br/>
-            </w:r>
-            <w:r>
-              <w:rPr>
-                <w:rFonts w:ascii="Courier New" w:hAnsi="Courier New"/>
-                <w:sz w:val="18"/>
-              </w:rPr>
               <w:t xml:space="preserve">  "name": "Walk Daily",</w:t>
               <w:br/>
-            </w:r>
-            <w:r>
-              <w:rPr>
-                <w:rFonts w:ascii="Courier New" w:hAnsi="Courier New"/>
-                <w:sz w:val="18"/>
-              </w:rPr>
               <w:t xml:space="preserve">  "description": "Walk for 20 minutes",</w:t>
               <w:br/>
-            </w:r>
-            <w:r>
-              <w:rPr>
-                <w:rFonts w:ascii="Courier New" w:hAnsi="Courier New"/>
-                <w:sz w:val="18"/>
-              </w:rPr>
               <w:t xml:space="preserve">  "frequency": "Daily"</w:t>
               <w:br/>
-            </w:r>
-            <w:r>
-              <w:rPr>
-                <w:rFonts w:ascii="Courier New" w:hAnsi="Courier New"/>
-                <w:sz w:val="18"/>
-              </w:rPr>
               <w:t>}</w:t>
             </w:r>
           </w:p>
         </w:tc>
       </w:tr>
     </w:tbl>
-    <w:p/>
     <w:p>
+      <w:pPr>
+        <w:pStyle w:val="Heading3"/>
+      </w:pPr>
       <w:r>
-        <w:rPr>
-          <w:b/>
-        </w:rPr>
-        <w:t>400 Bad Request</w:t>
+        <w:t>Possible error responses:</w:t>
       </w:r>
     </w:p>
     <w:tbl>
       <w:tblPr>
-        <w:tblStyle w:val="TableGrid"/>
         <w:tblW w:type="auto" w:w="0"/>
+        <w:jc w:val="center"/>
+        <w:tblLayout w:type="fixed"/>
         <w:tblLook w:firstColumn="1" w:firstRow="1" w:lastColumn="0" w:lastRow="0" w:noHBand="0" w:noVBand="1" w:val="04A0"/>
       </w:tblPr>
       <w:tblGrid>
-        <w:gridCol w:w="9648"/>
+        <w:gridCol w:w="9936"/>
       </w:tblGrid>
       <w:tr>
         <w:tc>
           <w:tcPr>
-            <w:tcW w:type="dxa" w:w="9648"/>
+            <w:tcW w:type="dxa" w:w="9360"/>
+            <w:vAlign w:val="center"/>
+            <w:shd w:fill="F3F6FA"/>
+            <w:tcBorders>
+              <w:top w:val="single" w:sz="4" w:color="D9E2F3"/>
+              <w:left w:val="single" w:sz="4" w:color="D9E2F3"/>
+              <w:bottom w:val="single" w:sz="4" w:color="D9E2F3"/>
+              <w:right w:val="single" w:sz="4" w:color="D9E2F3"/>
+            </w:tcBorders>
           </w:tcPr>
           <w:p>
+            <w:pPr>
+              <w:spacing w:before="60" w:after="60"/>
+            </w:pPr>
             <w:r>
               <w:rPr>
-                <w:rFonts w:ascii="Courier New" w:hAnsi="Courier New"/>
+                <w:rFonts w:ascii="Consolas" w:hAnsi="Consolas"/>
                 <w:sz w:val="18"/>
               </w:rPr>
+              <w:t>400 Bad Request</w:t>
+              <w:br/>
               <w:t>{</w:t>
               <w:br/>
-            </w:r>
-            <w:r>
-              <w:rPr>
-                <w:rFonts w:ascii="Courier New" w:hAnsi="Courier New"/>
-                <w:sz w:val="18"/>
-              </w:rPr>
               <w:t xml:space="preserve">  "error": "Name and frequency are required"</w:t>
               <w:br/>
-            </w:r>
-            <w:r>
-              <w:rPr>
-                <w:rFonts w:ascii="Courier New" w:hAnsi="Courier New"/>
-                <w:sz w:val="18"/>
-              </w:rPr>
               <w:t>}</w:t>
-            </w:r>
-          </w:p>
-        </w:tc>
-      </w:tr>
-    </w:tbl>
-    <w:p/>
-    <w:p>
-      <w:r>
-        <w:rPr>
-          <w:b/>
-        </w:rPr>
-        <w:t>405 Method Not Allowed</w:t>
-      </w:r>
-    </w:p>
-    <w:tbl>
-      <w:tblPr>
-        <w:tblStyle w:val="TableGrid"/>
-        <w:tblW w:type="auto" w:w="0"/>
-        <w:tblLook w:firstColumn="1" w:firstRow="1" w:lastColumn="0" w:lastRow="0" w:noHBand="0" w:noVBand="1" w:val="04A0"/>
-      </w:tblPr>
-      <w:tblGrid>
-        <w:gridCol w:w="9648"/>
-      </w:tblGrid>
-      <w:tr>
-        <w:tc>
-          <w:tcPr>
-            <w:tcW w:type="dxa" w:w="9648"/>
-          </w:tcPr>
-          <w:p>
-            <w:r>
-              <w:rPr>
-                <w:rFonts w:ascii="Courier New" w:hAnsi="Courier New"/>
-                <w:sz w:val="18"/>
-              </w:rPr>
+              <w:br/>
+              <w:br/>
+              <w:t>400 Bad Request</w:t>
+              <w:br/>
               <w:t>{</w:t>
               <w:br/>
-            </w:r>
-            <w:r>
-              <w:rPr>
-                <w:rFonts w:ascii="Courier New" w:hAnsi="Courier New"/>
-                <w:sz w:val="18"/>
-              </w:rPr>
+              <w:t xml:space="preserve">  "error": "Frequency must be either 'Daily' or 'Weekly'"</w:t>
+              <w:br/>
+              <w:t>}</w:t>
+              <w:br/>
+              <w:br/>
+              <w:t>405 Method Not Allowed</w:t>
+              <w:br/>
+              <w:t>{</w:t>
+              <w:br/>
               <w:t xml:space="preserve">  "error": "Only POST method is allowed"</w:t>
               <w:br/>
-            </w:r>
-            <w:r>
-              <w:rPr>
-                <w:rFonts w:ascii="Courier New" w:hAnsi="Courier New"/>
-                <w:sz w:val="18"/>
-              </w:rPr>
               <w:t>}</w:t>
             </w:r>
           </w:p>
@@ -877,26 +830,25 @@
     </w:p>
     <w:tbl>
       <w:tblPr>
-        <w:tblStyle w:val="TableGrid"/>
         <w:tblW w:type="auto" w:w="0"/>
+        <w:jc w:val="center"/>
+        <w:tblLayout w:type="fixed"/>
         <w:tblLook w:firstColumn="1" w:firstRow="1" w:lastColumn="0" w:lastRow="0" w:noHBand="0" w:noVBand="1" w:val="04A0"/>
       </w:tblPr>
       <w:tblGrid>
-        <w:gridCol w:w="4824"/>
-        <w:gridCol w:w="4824"/>
+        <w:gridCol w:w="4968"/>
+        <w:gridCol w:w="4968"/>
       </w:tblGrid>
       <w:tr>
         <w:tc>
           <w:tcPr>
-            <w:tcW w:type="dxa" w:w="4824"/>
+            <w:tcW w:type="dxa" w:w="2016"/>
+            <w:shd w:fill="EAF1FB"/>
           </w:tcPr>
           <w:p>
-            <w:pPr>
-              <w:spacing w:after="0"/>
-            </w:pPr>
             <w:r>
               <w:rPr>
-                <w:sz w:val="20"/>
+                <w:b/>
               </w:rPr>
               <w:t>Method</w:t>
             </w:r>
@@ -904,16 +856,10 @@
         </w:tc>
         <w:tc>
           <w:tcPr>
-            <w:tcW w:type="dxa" w:w="4824"/>
+            <w:tcW w:type="dxa" w:w="7344"/>
           </w:tcPr>
           <w:p>
-            <w:pPr>
-              <w:spacing w:after="0"/>
-            </w:pPr>
             <w:r>
-              <w:rPr>
-                <w:sz w:val="20"/>
-              </w:rPr>
               <w:t>PUT</w:t>
             </w:r>
           </w:p>
@@ -922,15 +868,13 @@
       <w:tr>
         <w:tc>
           <w:tcPr>
-            <w:tcW w:type="dxa" w:w="4824"/>
+            <w:tcW w:type="dxa" w:w="2016"/>
+            <w:shd w:fill="EAF1FB"/>
           </w:tcPr>
           <w:p>
-            <w:pPr>
-              <w:spacing w:after="0"/>
-            </w:pPr>
             <w:r>
               <w:rPr>
-                <w:sz w:val="20"/>
+                <w:b/>
               </w:rPr>
               <w:t>Endpoint</w:t>
             </w:r>
@@ -938,16 +882,10 @@
         </w:tc>
         <w:tc>
           <w:tcPr>
-            <w:tcW w:type="dxa" w:w="4824"/>
+            <w:tcW w:type="dxa" w:w="7344"/>
           </w:tcPr>
           <w:p>
-            <w:pPr>
-              <w:spacing w:after="0"/>
-            </w:pPr>
             <w:r>
-              <w:rPr>
-                <w:sz w:val="20"/>
-              </w:rPr>
               <w:t>/habits/&lt;id&gt;/update/</w:t>
             </w:r>
           </w:p>
@@ -956,15 +894,13 @@
       <w:tr>
         <w:tc>
           <w:tcPr>
-            <w:tcW w:type="dxa" w:w="4824"/>
+            <w:tcW w:type="dxa" w:w="2016"/>
+            <w:shd w:fill="EAF1FB"/>
           </w:tcPr>
           <w:p>
-            <w:pPr>
-              <w:spacing w:after="0"/>
-            </w:pPr>
             <w:r>
               <w:rPr>
-                <w:sz w:val="20"/>
+                <w:b/>
               </w:rPr>
               <w:t>Description</w:t>
             </w:r>
@@ -972,147 +908,186 @@
         </w:tc>
         <w:tc>
           <w:tcPr>
-            <w:tcW w:type="dxa" w:w="4824"/>
+            <w:tcW w:type="dxa" w:w="7344"/>
           </w:tcPr>
           <w:p>
-            <w:pPr>
-              <w:spacing w:after="0"/>
-            </w:pPr>
             <w:r>
-              <w:rPr>
-                <w:sz w:val="20"/>
-              </w:rPr>
               <w:t>Updates an existing habit by ID.</w:t>
             </w:r>
           </w:p>
         </w:tc>
       </w:tr>
+      <w:tr>
+        <w:tc>
+          <w:tcPr>
+            <w:tcW w:type="dxa" w:w="2016"/>
+            <w:shd w:fill="EAF1FB"/>
+          </w:tcPr>
+          <w:p>
+            <w:r>
+              <w:rPr>
+                <w:b/>
+              </w:rPr>
+              <w:t>Success</w:t>
+            </w:r>
+          </w:p>
+        </w:tc>
+        <w:tc>
+          <w:tcPr>
+            <w:tcW w:type="dxa" w:w="7344"/>
+          </w:tcPr>
+          <w:p>
+            <w:r>
+              <w:t>200 OK</w:t>
+            </w:r>
+          </w:p>
+        </w:tc>
+      </w:tr>
     </w:tbl>
-    <w:p/>
     <w:p>
       <w:r>
         <w:rPr>
           <w:b/>
         </w:rPr>
-        <w:t xml:space="preserve">Status codes: </w:t>
+        <w:t xml:space="preserve">Allowed frequency values: </w:t>
       </w:r>
       <w:r>
-        <w:t>200 OK, 400 Bad Request, 404 Not Found, 405 Method Not Allowed</w:t>
+        <w:t>Daily, Weekly</w:t>
       </w:r>
     </w:p>
     <w:p>
       <w:pPr>
-        <w:pStyle w:val="Heading2"/>
+        <w:pStyle w:val="Heading3"/>
       </w:pPr>
       <w:r>
-        <w:t>Request / Response Examples</w:t>
-      </w:r>
-    </w:p>
-    <w:p>
-      <w:r>
-        <w:rPr>
-          <w:b/>
-        </w:rPr>
-        <w:t xml:space="preserve">Required fields: </w:t>
-      </w:r>
-      <w:r>
-        <w:t>name, frequency</w:t>
-      </w:r>
-    </w:p>
-    <w:p>
-      <w:r>
-        <w:rPr>
-          <w:b/>
-        </w:rPr>
-        <w:t xml:space="preserve">Optional field: </w:t>
-      </w:r>
-      <w:r>
-        <w:t>description</w:t>
+        <w:t>Example payload/response:</w:t>
       </w:r>
     </w:p>
     <w:tbl>
       <w:tblPr>
-        <w:tblStyle w:val="TableGrid"/>
         <w:tblW w:type="auto" w:w="0"/>
+        <w:jc w:val="center"/>
+        <w:tblLayout w:type="fixed"/>
         <w:tblLook w:firstColumn="1" w:firstRow="1" w:lastColumn="0" w:lastRow="0" w:noHBand="0" w:noVBand="1" w:val="04A0"/>
       </w:tblPr>
       <w:tblGrid>
-        <w:gridCol w:w="9648"/>
+        <w:gridCol w:w="9936"/>
       </w:tblGrid>
       <w:tr>
         <w:tc>
           <w:tcPr>
-            <w:tcW w:type="dxa" w:w="9648"/>
+            <w:tcW w:type="dxa" w:w="9360"/>
+            <w:vAlign w:val="center"/>
+            <w:shd w:fill="F3F6FA"/>
+            <w:tcBorders>
+              <w:top w:val="single" w:sz="4" w:color="D9E2F3"/>
+              <w:left w:val="single" w:sz="4" w:color="D9E2F3"/>
+              <w:bottom w:val="single" w:sz="4" w:color="D9E2F3"/>
+              <w:right w:val="single" w:sz="4" w:color="D9E2F3"/>
+            </w:tcBorders>
           </w:tcPr>
           <w:p>
+            <w:pPr>
+              <w:spacing w:before="60" w:after="60"/>
+            </w:pPr>
             <w:r>
               <w:rPr>
-                <w:rFonts w:ascii="Courier New" w:hAnsi="Courier New"/>
+                <w:rFonts w:ascii="Consolas" w:hAnsi="Consolas"/>
                 <w:sz w:val="18"/>
               </w:rPr>
               <w:t>{</w:t>
               <w:br/>
-            </w:r>
-            <w:r>
-              <w:rPr>
-                <w:rFonts w:ascii="Courier New" w:hAnsi="Courier New"/>
-                <w:sz w:val="18"/>
-              </w:rPr>
               <w:t xml:space="preserve">  "name": "Drink More Water",</w:t>
               <w:br/>
-            </w:r>
-            <w:r>
-              <w:rPr>
-                <w:rFonts w:ascii="Courier New" w:hAnsi="Courier New"/>
-                <w:sz w:val="18"/>
-              </w:rPr>
               <w:t xml:space="preserve">  "description": "Drink 3 litres daily",</w:t>
               <w:br/>
-            </w:r>
-            <w:r>
-              <w:rPr>
-                <w:rFonts w:ascii="Courier New" w:hAnsi="Courier New"/>
-                <w:sz w:val="18"/>
-              </w:rPr>
               <w:t xml:space="preserve">  "frequency": "Daily"</w:t>
               <w:br/>
-            </w:r>
-            <w:r>
-              <w:rPr>
-                <w:rFonts w:ascii="Courier New" w:hAnsi="Courier New"/>
-                <w:sz w:val="18"/>
-              </w:rPr>
               <w:t>}</w:t>
             </w:r>
           </w:p>
         </w:tc>
       </w:tr>
     </w:tbl>
-    <w:p/>
     <w:p>
       <w:pPr>
-        <w:pStyle w:val="ListBullet"/>
+        <w:pStyle w:val="Heading3"/>
       </w:pPr>
       <w:r>
-        <w:t>400 -&gt; {"error": "Name and frequency are required"}</w:t>
+        <w:t>Possible error responses:</w:t>
       </w:r>
     </w:p>
-    <w:p>
-      <w:pPr>
-        <w:pStyle w:val="ListBullet"/>
-      </w:pPr>
-      <w:r>
-        <w:t>404 -&gt; {"error": "Habit not found"}</w:t>
-      </w:r>
-    </w:p>
-    <w:p>
-      <w:pPr>
-        <w:pStyle w:val="ListBullet"/>
-      </w:pPr>
-      <w:r>
-        <w:t>405 -&gt; {"error": "Only PUT method is allowed"}</w:t>
-      </w:r>
-    </w:p>
+    <w:tbl>
+      <w:tblPr>
+        <w:tblW w:type="auto" w:w="0"/>
+        <w:jc w:val="center"/>
+        <w:tblLayout w:type="fixed"/>
+        <w:tblLook w:firstColumn="1" w:firstRow="1" w:lastColumn="0" w:lastRow="0" w:noHBand="0" w:noVBand="1" w:val="04A0"/>
+      </w:tblPr>
+      <w:tblGrid>
+        <w:gridCol w:w="9936"/>
+      </w:tblGrid>
+      <w:tr>
+        <w:tc>
+          <w:tcPr>
+            <w:tcW w:type="dxa" w:w="9360"/>
+            <w:vAlign w:val="center"/>
+            <w:shd w:fill="F3F6FA"/>
+            <w:tcBorders>
+              <w:top w:val="single" w:sz="4" w:color="D9E2F3"/>
+              <w:left w:val="single" w:sz="4" w:color="D9E2F3"/>
+              <w:bottom w:val="single" w:sz="4" w:color="D9E2F3"/>
+              <w:right w:val="single" w:sz="4" w:color="D9E2F3"/>
+            </w:tcBorders>
+          </w:tcPr>
+          <w:p>
+            <w:pPr>
+              <w:spacing w:before="60" w:after="60"/>
+            </w:pPr>
+            <w:r>
+              <w:rPr>
+                <w:rFonts w:ascii="Consolas" w:hAnsi="Consolas"/>
+                <w:sz w:val="18"/>
+              </w:rPr>
+              <w:t>400 Bad Request</w:t>
+              <w:br/>
+              <w:t>{</w:t>
+              <w:br/>
+              <w:t xml:space="preserve">  "error": "Name and frequency are required"</w:t>
+              <w:br/>
+              <w:t>}</w:t>
+              <w:br/>
+              <w:br/>
+              <w:t>400 Bad Request</w:t>
+              <w:br/>
+              <w:t>{</w:t>
+              <w:br/>
+              <w:t xml:space="preserve">  "error": "Frequency must be either 'Daily' or 'Weekly'"</w:t>
+              <w:br/>
+              <w:t>}</w:t>
+              <w:br/>
+              <w:br/>
+              <w:t>404 Not Found</w:t>
+              <w:br/>
+              <w:t>{</w:t>
+              <w:br/>
+              <w:t xml:space="preserve">  "error": "Habit not found"</w:t>
+              <w:br/>
+              <w:t>}</w:t>
+              <w:br/>
+              <w:br/>
+              <w:t>405 Method Not Allowed</w:t>
+              <w:br/>
+              <w:t>{</w:t>
+              <w:br/>
+              <w:t xml:space="preserve">  "error": "Only PUT method is allowed"</w:t>
+              <w:br/>
+              <w:t>}</w:t>
+            </w:r>
+          </w:p>
+        </w:tc>
+      </w:tr>
+    </w:tbl>
     <w:p/>
     <w:p>
       <w:pPr>
@@ -1124,26 +1099,25 @@
     </w:p>
     <w:tbl>
       <w:tblPr>
-        <w:tblStyle w:val="TableGrid"/>
         <w:tblW w:type="auto" w:w="0"/>
+        <w:jc w:val="center"/>
+        <w:tblLayout w:type="fixed"/>
         <w:tblLook w:firstColumn="1" w:firstRow="1" w:lastColumn="0" w:lastRow="0" w:noHBand="0" w:noVBand="1" w:val="04A0"/>
       </w:tblPr>
       <w:tblGrid>
-        <w:gridCol w:w="4824"/>
-        <w:gridCol w:w="4824"/>
+        <w:gridCol w:w="4968"/>
+        <w:gridCol w:w="4968"/>
       </w:tblGrid>
       <w:tr>
         <w:tc>
           <w:tcPr>
-            <w:tcW w:type="dxa" w:w="4824"/>
+            <w:tcW w:type="dxa" w:w="2016"/>
+            <w:shd w:fill="EAF1FB"/>
           </w:tcPr>
           <w:p>
-            <w:pPr>
-              <w:spacing w:after="0"/>
-            </w:pPr>
             <w:r>
               <w:rPr>
-                <w:sz w:val="20"/>
+                <w:b/>
               </w:rPr>
               <w:t>Method</w:t>
             </w:r>
@@ -1151,16 +1125,10 @@
         </w:tc>
         <w:tc>
           <w:tcPr>
-            <w:tcW w:type="dxa" w:w="4824"/>
+            <w:tcW w:type="dxa" w:w="7344"/>
           </w:tcPr>
           <w:p>
-            <w:pPr>
-              <w:spacing w:after="0"/>
-            </w:pPr>
             <w:r>
-              <w:rPr>
-                <w:sz w:val="20"/>
-              </w:rPr>
               <w:t>DELETE</w:t>
             </w:r>
           </w:p>
@@ -1169,15 +1137,13 @@
       <w:tr>
         <w:tc>
           <w:tcPr>
-            <w:tcW w:type="dxa" w:w="4824"/>
+            <w:tcW w:type="dxa" w:w="2016"/>
+            <w:shd w:fill="EAF1FB"/>
           </w:tcPr>
           <w:p>
-            <w:pPr>
-              <w:spacing w:after="0"/>
-            </w:pPr>
             <w:r>
               <w:rPr>
-                <w:sz w:val="20"/>
+                <w:b/>
               </w:rPr>
               <w:t>Endpoint</w:t>
             </w:r>
@@ -1185,16 +1151,10 @@
         </w:tc>
         <w:tc>
           <w:tcPr>
-            <w:tcW w:type="dxa" w:w="4824"/>
+            <w:tcW w:type="dxa" w:w="7344"/>
           </w:tcPr>
           <w:p>
-            <w:pPr>
-              <w:spacing w:after="0"/>
-            </w:pPr>
             <w:r>
-              <w:rPr>
-                <w:sz w:val="20"/>
-              </w:rPr>
               <w:t>/habits/&lt;id&gt;/delete/</w:t>
             </w:r>
           </w:p>
@@ -1203,15 +1163,13 @@
       <w:tr>
         <w:tc>
           <w:tcPr>
-            <w:tcW w:type="dxa" w:w="4824"/>
+            <w:tcW w:type="dxa" w:w="2016"/>
+            <w:shd w:fill="EAF1FB"/>
           </w:tcPr>
           <w:p>
-            <w:pPr>
-              <w:spacing w:after="0"/>
-            </w:pPr>
             <w:r>
               <w:rPr>
-                <w:sz w:val="20"/>
+                <w:b/>
               </w:rPr>
               <w:t>Description</w:t>
             </w:r>
@@ -1219,109 +1177,153 @@
         </w:tc>
         <w:tc>
           <w:tcPr>
-            <w:tcW w:type="dxa" w:w="4824"/>
+            <w:tcW w:type="dxa" w:w="7344"/>
           </w:tcPr>
           <w:p>
-            <w:pPr>
-              <w:spacing w:after="0"/>
-            </w:pPr>
             <w:r>
-              <w:rPr>
-                <w:sz w:val="20"/>
-              </w:rPr>
               <w:t>Deletes a habit by ID.</w:t>
             </w:r>
           </w:p>
         </w:tc>
       </w:tr>
+      <w:tr>
+        <w:tc>
+          <w:tcPr>
+            <w:tcW w:type="dxa" w:w="2016"/>
+            <w:shd w:fill="EAF1FB"/>
+          </w:tcPr>
+          <w:p>
+            <w:r>
+              <w:rPr>
+                <w:b/>
+              </w:rPr>
+              <w:t>Success</w:t>
+            </w:r>
+          </w:p>
+        </w:tc>
+        <w:tc>
+          <w:tcPr>
+            <w:tcW w:type="dxa" w:w="7344"/>
+          </w:tcPr>
+          <w:p>
+            <w:r>
+              <w:t>200 OK</w:t>
+            </w:r>
+          </w:p>
+        </w:tc>
+      </w:tr>
     </w:tbl>
-    <w:p/>
-    <w:p>
-      <w:r>
-        <w:rPr>
-          <w:b/>
-        </w:rPr>
-        <w:t xml:space="preserve">Status codes: </w:t>
-      </w:r>
-      <w:r>
-        <w:t>200 OK, 404 Not Found, 405 Method Not Allowed</w:t>
-      </w:r>
-    </w:p>
     <w:p>
       <w:pPr>
-        <w:pStyle w:val="Heading2"/>
+        <w:pStyle w:val="Heading3"/>
       </w:pPr>
       <w:r>
-        <w:t>Example Response</w:t>
-      </w:r>
-    </w:p>
-    <w:p>
-      <w:r>
-        <w:rPr>
-          <w:b/>
-        </w:rPr>
-        <w:t>200 OK</w:t>
+        <w:t>Example payload/response:</w:t>
       </w:r>
     </w:p>
     <w:tbl>
       <w:tblPr>
-        <w:tblStyle w:val="TableGrid"/>
         <w:tblW w:type="auto" w:w="0"/>
+        <w:jc w:val="center"/>
+        <w:tblLayout w:type="fixed"/>
         <w:tblLook w:firstColumn="1" w:firstRow="1" w:lastColumn="0" w:lastRow="0" w:noHBand="0" w:noVBand="1" w:val="04A0"/>
       </w:tblPr>
       <w:tblGrid>
-        <w:gridCol w:w="9648"/>
+        <w:gridCol w:w="9936"/>
       </w:tblGrid>
       <w:tr>
         <w:tc>
           <w:tcPr>
-            <w:tcW w:type="dxa" w:w="9648"/>
+            <w:tcW w:type="dxa" w:w="9360"/>
+            <w:vAlign w:val="center"/>
+            <w:shd w:fill="F3F6FA"/>
+            <w:tcBorders>
+              <w:top w:val="single" w:sz="4" w:color="D9E2F3"/>
+              <w:left w:val="single" w:sz="4" w:color="D9E2F3"/>
+              <w:bottom w:val="single" w:sz="4" w:color="D9E2F3"/>
+              <w:right w:val="single" w:sz="4" w:color="D9E2F3"/>
+            </w:tcBorders>
           </w:tcPr>
           <w:p>
+            <w:pPr>
+              <w:spacing w:before="60" w:after="60"/>
+            </w:pPr>
             <w:r>
               <w:rPr>
-                <w:rFonts w:ascii="Courier New" w:hAnsi="Courier New"/>
+                <w:rFonts w:ascii="Consolas" w:hAnsi="Consolas"/>
                 <w:sz w:val="18"/>
               </w:rPr>
               <w:t>{</w:t>
               <w:br/>
-            </w:r>
-            <w:r>
-              <w:rPr>
-                <w:rFonts w:ascii="Courier New" w:hAnsi="Courier New"/>
-                <w:sz w:val="18"/>
-              </w:rPr>
               <w:t xml:space="preserve">  "message": "Habit deleted successfully"</w:t>
               <w:br/>
-            </w:r>
-            <w:r>
-              <w:rPr>
-                <w:rFonts w:ascii="Courier New" w:hAnsi="Courier New"/>
-                <w:sz w:val="18"/>
-              </w:rPr>
               <w:t>}</w:t>
             </w:r>
           </w:p>
         </w:tc>
       </w:tr>
     </w:tbl>
-    <w:p/>
     <w:p>
       <w:pPr>
-        <w:pStyle w:val="ListBullet"/>
+        <w:pStyle w:val="Heading3"/>
       </w:pPr>
       <w:r>
-        <w:t>404 -&gt; {"error": "Habit not found"}</w:t>
+        <w:t>Possible error responses:</w:t>
       </w:r>
     </w:p>
-    <w:p>
-      <w:pPr>
-        <w:pStyle w:val="ListBullet"/>
-      </w:pPr>
-      <w:r>
-        <w:t>405 -&gt; {"error": "Only DELETE method is allowed"}</w:t>
-      </w:r>
-    </w:p>
+    <w:tbl>
+      <w:tblPr>
+        <w:tblW w:type="auto" w:w="0"/>
+        <w:jc w:val="center"/>
+        <w:tblLayout w:type="fixed"/>
+        <w:tblLook w:firstColumn="1" w:firstRow="1" w:lastColumn="0" w:lastRow="0" w:noHBand="0" w:noVBand="1" w:val="04A0"/>
+      </w:tblPr>
+      <w:tblGrid>
+        <w:gridCol w:w="9936"/>
+      </w:tblGrid>
+      <w:tr>
+        <w:tc>
+          <w:tcPr>
+            <w:tcW w:type="dxa" w:w="9360"/>
+            <w:vAlign w:val="center"/>
+            <w:shd w:fill="F3F6FA"/>
+            <w:tcBorders>
+              <w:top w:val="single" w:sz="4" w:color="D9E2F3"/>
+              <w:left w:val="single" w:sz="4" w:color="D9E2F3"/>
+              <w:bottom w:val="single" w:sz="4" w:color="D9E2F3"/>
+              <w:right w:val="single" w:sz="4" w:color="D9E2F3"/>
+            </w:tcBorders>
+          </w:tcPr>
+          <w:p>
+            <w:pPr>
+              <w:spacing w:before="60" w:after="60"/>
+            </w:pPr>
+            <w:r>
+              <w:rPr>
+                <w:rFonts w:ascii="Consolas" w:hAnsi="Consolas"/>
+                <w:sz w:val="18"/>
+              </w:rPr>
+              <w:t>404 Not Found</w:t>
+              <w:br/>
+              <w:t>{</w:t>
+              <w:br/>
+              <w:t xml:space="preserve">  "error": "Habit not found"</w:t>
+              <w:br/>
+              <w:t>}</w:t>
+              <w:br/>
+              <w:br/>
+              <w:t>405 Method Not Allowed</w:t>
+              <w:br/>
+              <w:t>{</w:t>
+              <w:br/>
+              <w:t xml:space="preserve">  "error": "Only DELETE method is allowed"</w:t>
+              <w:br/>
+              <w:t>}</w:t>
+            </w:r>
+          </w:p>
+        </w:tc>
+      </w:tr>
+    </w:tbl>
     <w:p/>
     <w:p>
       <w:pPr>
@@ -1333,26 +1335,25 @@
     </w:p>
     <w:tbl>
       <w:tblPr>
-        <w:tblStyle w:val="TableGrid"/>
         <w:tblW w:type="auto" w:w="0"/>
+        <w:jc w:val="center"/>
+        <w:tblLayout w:type="fixed"/>
         <w:tblLook w:firstColumn="1" w:firstRow="1" w:lastColumn="0" w:lastRow="0" w:noHBand="0" w:noVBand="1" w:val="04A0"/>
       </w:tblPr>
       <w:tblGrid>
-        <w:gridCol w:w="4824"/>
-        <w:gridCol w:w="4824"/>
+        <w:gridCol w:w="4968"/>
+        <w:gridCol w:w="4968"/>
       </w:tblGrid>
       <w:tr>
         <w:tc>
           <w:tcPr>
-            <w:tcW w:type="dxa" w:w="4824"/>
+            <w:tcW w:type="dxa" w:w="2016"/>
+            <w:shd w:fill="EAF1FB"/>
           </w:tcPr>
           <w:p>
-            <w:pPr>
-              <w:spacing w:after="0"/>
-            </w:pPr>
             <w:r>
               <w:rPr>
-                <w:sz w:val="20"/>
+                <w:b/>
               </w:rPr>
               <w:t>Method</w:t>
             </w:r>
@@ -1360,16 +1361,10 @@
         </w:tc>
         <w:tc>
           <w:tcPr>
-            <w:tcW w:type="dxa" w:w="4824"/>
+            <w:tcW w:type="dxa" w:w="7344"/>
           </w:tcPr>
           <w:p>
-            <w:pPr>
-              <w:spacing w:after="0"/>
-            </w:pPr>
             <w:r>
-              <w:rPr>
-                <w:sz w:val="20"/>
-              </w:rPr>
               <w:t>GET</w:t>
             </w:r>
           </w:p>
@@ -1378,15 +1373,13 @@
       <w:tr>
         <w:tc>
           <w:tcPr>
-            <w:tcW w:type="dxa" w:w="4824"/>
+            <w:tcW w:type="dxa" w:w="2016"/>
+            <w:shd w:fill="EAF1FB"/>
           </w:tcPr>
           <w:p>
-            <w:pPr>
-              <w:spacing w:after="0"/>
-            </w:pPr>
             <w:r>
               <w:rPr>
-                <w:sz w:val="20"/>
+                <w:b/>
               </w:rPr>
               <w:t>Endpoint</w:t>
             </w:r>
@@ -1394,16 +1387,10 @@
         </w:tc>
         <w:tc>
           <w:tcPr>
-            <w:tcW w:type="dxa" w:w="4824"/>
+            <w:tcW w:type="dxa" w:w="7344"/>
           </w:tcPr>
           <w:p>
-            <w:pPr>
-              <w:spacing w:after="0"/>
-            </w:pPr>
             <w:r>
-              <w:rPr>
-                <w:sz w:val="20"/>
-              </w:rPr>
               <w:t>/habits/summary/</w:t>
             </w:r>
           </w:p>
@@ -1412,15 +1399,13 @@
       <w:tr>
         <w:tc>
           <w:tcPr>
-            <w:tcW w:type="dxa" w:w="4824"/>
+            <w:tcW w:type="dxa" w:w="2016"/>
+            <w:shd w:fill="EAF1FB"/>
           </w:tcPr>
           <w:p>
-            <w:pPr>
-              <w:spacing w:after="0"/>
-            </w:pPr>
             <w:r>
               <w:rPr>
-                <w:sz w:val="20"/>
+                <w:b/>
               </w:rPr>
               <w:t>Description</w:t>
             </w:r>
@@ -1428,17 +1413,91 @@
         </w:tc>
         <w:tc>
           <w:tcPr>
-            <w:tcW w:type="dxa" w:w="4824"/>
+            <w:tcW w:type="dxa" w:w="7344"/>
+          </w:tcPr>
+          <w:p>
+            <w:r>
+              <w:t>Returns a simple summary of habit data.</w:t>
+            </w:r>
+          </w:p>
+        </w:tc>
+      </w:tr>
+      <w:tr>
+        <w:tc>
+          <w:tcPr>
+            <w:tcW w:type="dxa" w:w="2016"/>
+            <w:shd w:fill="EAF1FB"/>
+          </w:tcPr>
+          <w:p>
+            <w:r>
+              <w:rPr>
+                <w:b/>
+              </w:rPr>
+              <w:t>Success</w:t>
+            </w:r>
+          </w:p>
+        </w:tc>
+        <w:tc>
+          <w:tcPr>
+            <w:tcW w:type="dxa" w:w="7344"/>
+          </w:tcPr>
+          <w:p>
+            <w:r>
+              <w:t>200 OK</w:t>
+            </w:r>
+          </w:p>
+        </w:tc>
+      </w:tr>
+    </w:tbl>
+    <w:p>
+      <w:pPr>
+        <w:pStyle w:val="Heading3"/>
+      </w:pPr>
+      <w:r>
+        <w:t>Example payload/response:</w:t>
+      </w:r>
+    </w:p>
+    <w:tbl>
+      <w:tblPr>
+        <w:tblW w:type="auto" w:w="0"/>
+        <w:jc w:val="center"/>
+        <w:tblLayout w:type="fixed"/>
+        <w:tblLook w:firstColumn="1" w:firstRow="1" w:lastColumn="0" w:lastRow="0" w:noHBand="0" w:noVBand="1" w:val="04A0"/>
+      </w:tblPr>
+      <w:tblGrid>
+        <w:gridCol w:w="9936"/>
+      </w:tblGrid>
+      <w:tr>
+        <w:tc>
+          <w:tcPr>
+            <w:tcW w:type="dxa" w:w="9360"/>
+            <w:vAlign w:val="center"/>
+            <w:shd w:fill="F3F6FA"/>
+            <w:tcBorders>
+              <w:top w:val="single" w:sz="4" w:color="D9E2F3"/>
+              <w:left w:val="single" w:sz="4" w:color="D9E2F3"/>
+              <w:bottom w:val="single" w:sz="4" w:color="D9E2F3"/>
+              <w:right w:val="single" w:sz="4" w:color="D9E2F3"/>
+            </w:tcBorders>
           </w:tcPr>
           <w:p>
             <w:pPr>
-              <w:spacing w:after="0"/>
+              <w:spacing w:before="60" w:after="60"/>
             </w:pPr>
             <w:r>
               <w:rPr>
-                <w:sz w:val="20"/>
+                <w:rFonts w:ascii="Consolas" w:hAnsi="Consolas"/>
+                <w:sz w:val="18"/>
               </w:rPr>
-              <w:t>Returns a simple summary of habit data.</w:t>
+              <w:t>{</w:t>
+              <w:br/>
+              <w:t xml:space="preserve">  "total_habits": 1,</w:t>
+              <w:br/>
+              <w:t xml:space="preserve">  "daily_habits": 1,</w:t>
+              <w:br/>
+              <w:t xml:space="preserve">  "weekly_habits": 0</w:t>
+              <w:br/>
+              <w:t>}</w:t>
             </w:r>
           </w:p>
         </w:tc>
@@ -1446,81 +1505,739 @@
     </w:tbl>
     <w:p/>
     <w:p>
+      <w:pPr>
+        <w:pStyle w:val="Heading1"/>
+      </w:pPr>
+      <w:r>
+        <w:t>7. Create Habit Log</w:t>
+      </w:r>
+    </w:p>
+    <w:tbl>
+      <w:tblPr>
+        <w:tblW w:type="auto" w:w="0"/>
+        <w:jc w:val="center"/>
+        <w:tblLayout w:type="fixed"/>
+        <w:tblLook w:firstColumn="1" w:firstRow="1" w:lastColumn="0" w:lastRow="0" w:noHBand="0" w:noVBand="1" w:val="04A0"/>
+      </w:tblPr>
+      <w:tblGrid>
+        <w:gridCol w:w="4968"/>
+        <w:gridCol w:w="4968"/>
+      </w:tblGrid>
+      <w:tr>
+        <w:tc>
+          <w:tcPr>
+            <w:tcW w:type="dxa" w:w="2016"/>
+            <w:shd w:fill="EAF1FB"/>
+          </w:tcPr>
+          <w:p>
+            <w:r>
+              <w:rPr>
+                <w:b/>
+              </w:rPr>
+              <w:t>Method</w:t>
+            </w:r>
+          </w:p>
+        </w:tc>
+        <w:tc>
+          <w:tcPr>
+            <w:tcW w:type="dxa" w:w="7344"/>
+          </w:tcPr>
+          <w:p>
+            <w:r>
+              <w:t>POST</w:t>
+            </w:r>
+          </w:p>
+        </w:tc>
+      </w:tr>
+      <w:tr>
+        <w:tc>
+          <w:tcPr>
+            <w:tcW w:type="dxa" w:w="2016"/>
+            <w:shd w:fill="EAF1FB"/>
+          </w:tcPr>
+          <w:p>
+            <w:r>
+              <w:rPr>
+                <w:b/>
+              </w:rPr>
+              <w:t>Endpoint</w:t>
+            </w:r>
+          </w:p>
+        </w:tc>
+        <w:tc>
+          <w:tcPr>
+            <w:tcW w:type="dxa" w:w="7344"/>
+          </w:tcPr>
+          <w:p>
+            <w:r>
+              <w:t>/habits/&lt;id&gt;/logs/create/</w:t>
+            </w:r>
+          </w:p>
+        </w:tc>
+      </w:tr>
+      <w:tr>
+        <w:tc>
+          <w:tcPr>
+            <w:tcW w:type="dxa" w:w="2016"/>
+            <w:shd w:fill="EAF1FB"/>
+          </w:tcPr>
+          <w:p>
+            <w:r>
+              <w:rPr>
+                <w:b/>
+              </w:rPr>
+              <w:t>Description</w:t>
+            </w:r>
+          </w:p>
+        </w:tc>
+        <w:tc>
+          <w:tcPr>
+            <w:tcW w:type="dxa" w:w="7344"/>
+          </w:tcPr>
+          <w:p>
+            <w:r>
+              <w:t>Creates a completion log for a specific habit.</w:t>
+            </w:r>
+          </w:p>
+        </w:tc>
+      </w:tr>
+      <w:tr>
+        <w:tc>
+          <w:tcPr>
+            <w:tcW w:type="dxa" w:w="2016"/>
+            <w:shd w:fill="EAF1FB"/>
+          </w:tcPr>
+          <w:p>
+            <w:r>
+              <w:rPr>
+                <w:b/>
+              </w:rPr>
+              <w:t>Success</w:t>
+            </w:r>
+          </w:p>
+        </w:tc>
+        <w:tc>
+          <w:tcPr>
+            <w:tcW w:type="dxa" w:w="7344"/>
+          </w:tcPr>
+          <w:p>
+            <w:r>
+              <w:t>201 Created</w:t>
+            </w:r>
+          </w:p>
+        </w:tc>
+      </w:tr>
+    </w:tbl>
+    <w:p>
       <w:r>
         <w:rPr>
           <w:b/>
         </w:rPr>
-        <w:t xml:space="preserve">Status codes: </w:t>
+        <w:t xml:space="preserve">Date format: </w:t>
       </w:r>
       <w:r>
-        <w:t>200 OK</w:t>
+        <w:t>YYYY-MM-DD</w:t>
       </w:r>
     </w:p>
     <w:p>
       <w:pPr>
-        <w:pStyle w:val="Heading2"/>
+        <w:pStyle w:val="Heading3"/>
       </w:pPr>
       <w:r>
-        <w:t>Example Response</w:t>
-      </w:r>
-    </w:p>
-    <w:p>
-      <w:r>
-        <w:t>Returned fields: total_habits, daily_habits, weekly_habits</w:t>
+        <w:t>Example payload/response:</w:t>
       </w:r>
     </w:p>
     <w:tbl>
       <w:tblPr>
-        <w:tblStyle w:val="TableGrid"/>
         <w:tblW w:type="auto" w:w="0"/>
+        <w:jc w:val="center"/>
+        <w:tblLayout w:type="fixed"/>
         <w:tblLook w:firstColumn="1" w:firstRow="1" w:lastColumn="0" w:lastRow="0" w:noHBand="0" w:noVBand="1" w:val="04A0"/>
       </w:tblPr>
       <w:tblGrid>
-        <w:gridCol w:w="9648"/>
+        <w:gridCol w:w="9936"/>
       </w:tblGrid>
       <w:tr>
         <w:tc>
           <w:tcPr>
-            <w:tcW w:type="dxa" w:w="9648"/>
+            <w:tcW w:type="dxa" w:w="9360"/>
+            <w:vAlign w:val="center"/>
+            <w:shd w:fill="F3F6FA"/>
+            <w:tcBorders>
+              <w:top w:val="single" w:sz="4" w:color="D9E2F3"/>
+              <w:left w:val="single" w:sz="4" w:color="D9E2F3"/>
+              <w:bottom w:val="single" w:sz="4" w:color="D9E2F3"/>
+              <w:right w:val="single" w:sz="4" w:color="D9E2F3"/>
+            </w:tcBorders>
+          </w:tcPr>
+          <w:p>
+            <w:pPr>
+              <w:spacing w:before="60" w:after="60"/>
+            </w:pPr>
+            <w:r>
+              <w:rPr>
+                <w:rFonts w:ascii="Consolas" w:hAnsi="Consolas"/>
+                <w:sz w:val="18"/>
+              </w:rPr>
+              <w:t>{</w:t>
+              <w:br/>
+              <w:t xml:space="preserve">  "completed_on": "2026-03-08",</w:t>
+              <w:br/>
+              <w:t xml:space="preserve">  "notes": "Completed after Fajr"</w:t>
+              <w:br/>
+              <w:t>}</w:t>
+            </w:r>
+          </w:p>
+        </w:tc>
+      </w:tr>
+    </w:tbl>
+    <w:p>
+      <w:pPr>
+        <w:pStyle w:val="Heading3"/>
+      </w:pPr>
+      <w:r>
+        <w:t>Possible error responses:</w:t>
+      </w:r>
+    </w:p>
+    <w:tbl>
+      <w:tblPr>
+        <w:tblW w:type="auto" w:w="0"/>
+        <w:jc w:val="center"/>
+        <w:tblLayout w:type="fixed"/>
+        <w:tblLook w:firstColumn="1" w:firstRow="1" w:lastColumn="0" w:lastRow="0" w:noHBand="0" w:noVBand="1" w:val="04A0"/>
+      </w:tblPr>
+      <w:tblGrid>
+        <w:gridCol w:w="9936"/>
+      </w:tblGrid>
+      <w:tr>
+        <w:tc>
+          <w:tcPr>
+            <w:tcW w:type="dxa" w:w="9360"/>
+            <w:vAlign w:val="center"/>
+            <w:shd w:fill="F3F6FA"/>
+            <w:tcBorders>
+              <w:top w:val="single" w:sz="4" w:color="D9E2F3"/>
+              <w:left w:val="single" w:sz="4" w:color="D9E2F3"/>
+              <w:bottom w:val="single" w:sz="4" w:color="D9E2F3"/>
+              <w:right w:val="single" w:sz="4" w:color="D9E2F3"/>
+            </w:tcBorders>
+          </w:tcPr>
+          <w:p>
+            <w:pPr>
+              <w:spacing w:before="60" w:after="60"/>
+            </w:pPr>
+            <w:r>
+              <w:rPr>
+                <w:rFonts w:ascii="Consolas" w:hAnsi="Consolas"/>
+                <w:sz w:val="18"/>
+              </w:rPr>
+              <w:t>400 Bad Request</w:t>
+              <w:br/>
+              <w:t>{</w:t>
+              <w:br/>
+              <w:t xml:space="preserve">  "error": "Invalid JSON body"</w:t>
+              <w:br/>
+              <w:t>}</w:t>
+              <w:br/>
+              <w:br/>
+              <w:t>400 Bad Request</w:t>
+              <w:br/>
+              <w:t>{</w:t>
+              <w:br/>
+              <w:t xml:space="preserve">  "error": "completed_on must be a valid date in YYYY-MM-DD format"</w:t>
+              <w:br/>
+              <w:t>}</w:t>
+              <w:br/>
+              <w:br/>
+              <w:t>404 Not Found</w:t>
+              <w:br/>
+              <w:t>{</w:t>
+              <w:br/>
+              <w:t xml:space="preserve">  "error": "Habit not found"</w:t>
+              <w:br/>
+              <w:t>}</w:t>
+              <w:br/>
+              <w:br/>
+              <w:t>405 Method Not Allowed</w:t>
+              <w:br/>
+              <w:t>{</w:t>
+              <w:br/>
+              <w:t xml:space="preserve">  "error": "Only POST method is allowed"</w:t>
+              <w:br/>
+              <w:t>}</w:t>
+            </w:r>
+          </w:p>
+        </w:tc>
+      </w:tr>
+    </w:tbl>
+    <w:p/>
+    <w:p>
+      <w:pPr>
+        <w:pStyle w:val="Heading1"/>
+      </w:pPr>
+      <w:r>
+        <w:t>8. Get Habit Logs</w:t>
+      </w:r>
+    </w:p>
+    <w:tbl>
+      <w:tblPr>
+        <w:tblW w:type="auto" w:w="0"/>
+        <w:jc w:val="center"/>
+        <w:tblLayout w:type="fixed"/>
+        <w:tblLook w:firstColumn="1" w:firstRow="1" w:lastColumn="0" w:lastRow="0" w:noHBand="0" w:noVBand="1" w:val="04A0"/>
+      </w:tblPr>
+      <w:tblGrid>
+        <w:gridCol w:w="4968"/>
+        <w:gridCol w:w="4968"/>
+      </w:tblGrid>
+      <w:tr>
+        <w:tc>
+          <w:tcPr>
+            <w:tcW w:type="dxa" w:w="2016"/>
+            <w:shd w:fill="EAF1FB"/>
           </w:tcPr>
           <w:p>
             <w:r>
               <w:rPr>
-                <w:rFonts w:ascii="Courier New" w:hAnsi="Courier New"/>
+                <w:b/>
+              </w:rPr>
+              <w:t>Method</w:t>
+            </w:r>
+          </w:p>
+        </w:tc>
+        <w:tc>
+          <w:tcPr>
+            <w:tcW w:type="dxa" w:w="7344"/>
+          </w:tcPr>
+          <w:p>
+            <w:r>
+              <w:t>GET</w:t>
+            </w:r>
+          </w:p>
+        </w:tc>
+      </w:tr>
+      <w:tr>
+        <w:tc>
+          <w:tcPr>
+            <w:tcW w:type="dxa" w:w="2016"/>
+            <w:shd w:fill="EAF1FB"/>
+          </w:tcPr>
+          <w:p>
+            <w:r>
+              <w:rPr>
+                <w:b/>
+              </w:rPr>
+              <w:t>Endpoint</w:t>
+            </w:r>
+          </w:p>
+        </w:tc>
+        <w:tc>
+          <w:tcPr>
+            <w:tcW w:type="dxa" w:w="7344"/>
+          </w:tcPr>
+          <w:p>
+            <w:r>
+              <w:t>/habits/&lt;id&gt;/logs/</w:t>
+            </w:r>
+          </w:p>
+        </w:tc>
+      </w:tr>
+      <w:tr>
+        <w:tc>
+          <w:tcPr>
+            <w:tcW w:type="dxa" w:w="2016"/>
+            <w:shd w:fill="EAF1FB"/>
+          </w:tcPr>
+          <w:p>
+            <w:r>
+              <w:rPr>
+                <w:b/>
+              </w:rPr>
+              <w:t>Description</w:t>
+            </w:r>
+          </w:p>
+        </w:tc>
+        <w:tc>
+          <w:tcPr>
+            <w:tcW w:type="dxa" w:w="7344"/>
+          </w:tcPr>
+          <w:p>
+            <w:r>
+              <w:t>Returns all completion logs for a specific habit.</w:t>
+            </w:r>
+          </w:p>
+        </w:tc>
+      </w:tr>
+      <w:tr>
+        <w:tc>
+          <w:tcPr>
+            <w:tcW w:type="dxa" w:w="2016"/>
+            <w:shd w:fill="EAF1FB"/>
+          </w:tcPr>
+          <w:p>
+            <w:r>
+              <w:rPr>
+                <w:b/>
+              </w:rPr>
+              <w:t>Success</w:t>
+            </w:r>
+          </w:p>
+        </w:tc>
+        <w:tc>
+          <w:tcPr>
+            <w:tcW w:type="dxa" w:w="7344"/>
+          </w:tcPr>
+          <w:p>
+            <w:r>
+              <w:t>200 OK</w:t>
+            </w:r>
+          </w:p>
+        </w:tc>
+      </w:tr>
+    </w:tbl>
+    <w:p>
+      <w:pPr>
+        <w:pStyle w:val="Heading3"/>
+      </w:pPr>
+      <w:r>
+        <w:t>Example payload/response:</w:t>
+      </w:r>
+    </w:p>
+    <w:tbl>
+      <w:tblPr>
+        <w:tblW w:type="auto" w:w="0"/>
+        <w:jc w:val="center"/>
+        <w:tblLayout w:type="fixed"/>
+        <w:tblLook w:firstColumn="1" w:firstRow="1" w:lastColumn="0" w:lastRow="0" w:noHBand="0" w:noVBand="1" w:val="04A0"/>
+      </w:tblPr>
+      <w:tblGrid>
+        <w:gridCol w:w="9936"/>
+      </w:tblGrid>
+      <w:tr>
+        <w:tc>
+          <w:tcPr>
+            <w:tcW w:type="dxa" w:w="9360"/>
+            <w:vAlign w:val="center"/>
+            <w:shd w:fill="F3F6FA"/>
+            <w:tcBorders>
+              <w:top w:val="single" w:sz="4" w:color="D9E2F3"/>
+              <w:left w:val="single" w:sz="4" w:color="D9E2F3"/>
+              <w:bottom w:val="single" w:sz="4" w:color="D9E2F3"/>
+              <w:right w:val="single" w:sz="4" w:color="D9E2F3"/>
+            </w:tcBorders>
+          </w:tcPr>
+          <w:p>
+            <w:pPr>
+              <w:spacing w:before="60" w:after="60"/>
+            </w:pPr>
+            <w:r>
+              <w:rPr>
+                <w:rFonts w:ascii="Consolas" w:hAnsi="Consolas"/>
+                <w:sz w:val="18"/>
+              </w:rPr>
+              <w:t>[</w:t>
+              <w:br/>
+              <w:t xml:space="preserve">  {</w:t>
+              <w:br/>
+              <w:t xml:space="preserve">    "id": 1,</w:t>
+              <w:br/>
+              <w:t xml:space="preserve">    "habit_id": 1,</w:t>
+              <w:br/>
+              <w:t xml:space="preserve">    "habit_name": "Drink More Water",</w:t>
+              <w:br/>
+              <w:t xml:space="preserve">    "completed_on": "2026-03-08",</w:t>
+              <w:br/>
+              <w:t xml:space="preserve">    "notes": "Completed after Fajr",</w:t>
+              <w:br/>
+              <w:t xml:space="preserve">    "created_at": "2026-03-08T16:39:34.817Z"</w:t>
+              <w:br/>
+              <w:t xml:space="preserve">  }</w:t>
+              <w:br/>
+              <w:t>]</w:t>
+            </w:r>
+          </w:p>
+        </w:tc>
+      </w:tr>
+    </w:tbl>
+    <w:p>
+      <w:pPr>
+        <w:pStyle w:val="Heading3"/>
+      </w:pPr>
+      <w:r>
+        <w:t>Possible error responses:</w:t>
+      </w:r>
+    </w:p>
+    <w:tbl>
+      <w:tblPr>
+        <w:tblW w:type="auto" w:w="0"/>
+        <w:jc w:val="center"/>
+        <w:tblLayout w:type="fixed"/>
+        <w:tblLook w:firstColumn="1" w:firstRow="1" w:lastColumn="0" w:lastRow="0" w:noHBand="0" w:noVBand="1" w:val="04A0"/>
+      </w:tblPr>
+      <w:tblGrid>
+        <w:gridCol w:w="9936"/>
+      </w:tblGrid>
+      <w:tr>
+        <w:tc>
+          <w:tcPr>
+            <w:tcW w:type="dxa" w:w="9360"/>
+            <w:vAlign w:val="center"/>
+            <w:shd w:fill="F3F6FA"/>
+            <w:tcBorders>
+              <w:top w:val="single" w:sz="4" w:color="D9E2F3"/>
+              <w:left w:val="single" w:sz="4" w:color="D9E2F3"/>
+              <w:bottom w:val="single" w:sz="4" w:color="D9E2F3"/>
+              <w:right w:val="single" w:sz="4" w:color="D9E2F3"/>
+            </w:tcBorders>
+          </w:tcPr>
+          <w:p>
+            <w:pPr>
+              <w:spacing w:before="60" w:after="60"/>
+            </w:pPr>
+            <w:r>
+              <w:rPr>
+                <w:rFonts w:ascii="Consolas" w:hAnsi="Consolas"/>
+                <w:sz w:val="18"/>
+              </w:rPr>
+              <w:t>404 Not Found</w:t>
+              <w:br/>
+              <w:t>{</w:t>
+              <w:br/>
+              <w:t xml:space="preserve">  "error": "Habit not found"</w:t>
+              <w:br/>
+              <w:t>}</w:t>
+            </w:r>
+          </w:p>
+        </w:tc>
+      </w:tr>
+    </w:tbl>
+    <w:p/>
+    <w:p>
+      <w:pPr>
+        <w:pStyle w:val="Heading1"/>
+      </w:pPr>
+      <w:r>
+        <w:t>9. Get Habit Streak</w:t>
+      </w:r>
+    </w:p>
+    <w:tbl>
+      <w:tblPr>
+        <w:tblW w:type="auto" w:w="0"/>
+        <w:jc w:val="center"/>
+        <w:tblLayout w:type="fixed"/>
+        <w:tblLook w:firstColumn="1" w:firstRow="1" w:lastColumn="0" w:lastRow="0" w:noHBand="0" w:noVBand="1" w:val="04A0"/>
+      </w:tblPr>
+      <w:tblGrid>
+        <w:gridCol w:w="4968"/>
+        <w:gridCol w:w="4968"/>
+      </w:tblGrid>
+      <w:tr>
+        <w:tc>
+          <w:tcPr>
+            <w:tcW w:type="dxa" w:w="2016"/>
+            <w:shd w:fill="EAF1FB"/>
+          </w:tcPr>
+          <w:p>
+            <w:r>
+              <w:rPr>
+                <w:b/>
+              </w:rPr>
+              <w:t>Method</w:t>
+            </w:r>
+          </w:p>
+        </w:tc>
+        <w:tc>
+          <w:tcPr>
+            <w:tcW w:type="dxa" w:w="7344"/>
+          </w:tcPr>
+          <w:p>
+            <w:r>
+              <w:t>GET</w:t>
+            </w:r>
+          </w:p>
+        </w:tc>
+      </w:tr>
+      <w:tr>
+        <w:tc>
+          <w:tcPr>
+            <w:tcW w:type="dxa" w:w="2016"/>
+            <w:shd w:fill="EAF1FB"/>
+          </w:tcPr>
+          <w:p>
+            <w:r>
+              <w:rPr>
+                <w:b/>
+              </w:rPr>
+              <w:t>Endpoint</w:t>
+            </w:r>
+          </w:p>
+        </w:tc>
+        <w:tc>
+          <w:tcPr>
+            <w:tcW w:type="dxa" w:w="7344"/>
+          </w:tcPr>
+          <w:p>
+            <w:r>
+              <w:t>/habits/&lt;id&gt;/streak/</w:t>
+            </w:r>
+          </w:p>
+        </w:tc>
+      </w:tr>
+      <w:tr>
+        <w:tc>
+          <w:tcPr>
+            <w:tcW w:type="dxa" w:w="2016"/>
+            <w:shd w:fill="EAF1FB"/>
+          </w:tcPr>
+          <w:p>
+            <w:r>
+              <w:rPr>
+                <w:b/>
+              </w:rPr>
+              <w:t>Description</w:t>
+            </w:r>
+          </w:p>
+        </w:tc>
+        <w:tc>
+          <w:tcPr>
+            <w:tcW w:type="dxa" w:w="7344"/>
+          </w:tcPr>
+          <w:p>
+            <w:r>
+              <w:t>Returns the current streak and total logs for a specific habit.</w:t>
+            </w:r>
+          </w:p>
+        </w:tc>
+      </w:tr>
+      <w:tr>
+        <w:tc>
+          <w:tcPr>
+            <w:tcW w:type="dxa" w:w="2016"/>
+            <w:shd w:fill="EAF1FB"/>
+          </w:tcPr>
+          <w:p>
+            <w:r>
+              <w:rPr>
+                <w:b/>
+              </w:rPr>
+              <w:t>Success</w:t>
+            </w:r>
+          </w:p>
+        </w:tc>
+        <w:tc>
+          <w:tcPr>
+            <w:tcW w:type="dxa" w:w="7344"/>
+          </w:tcPr>
+          <w:p>
+            <w:r>
+              <w:t>200 OK</w:t>
+            </w:r>
+          </w:p>
+        </w:tc>
+      </w:tr>
+    </w:tbl>
+    <w:p>
+      <w:pPr>
+        <w:pStyle w:val="Heading3"/>
+      </w:pPr>
+      <w:r>
+        <w:t>Example payload/response:</w:t>
+      </w:r>
+    </w:p>
+    <w:tbl>
+      <w:tblPr>
+        <w:tblW w:type="auto" w:w="0"/>
+        <w:jc w:val="center"/>
+        <w:tblLayout w:type="fixed"/>
+        <w:tblLook w:firstColumn="1" w:firstRow="1" w:lastColumn="0" w:lastRow="0" w:noHBand="0" w:noVBand="1" w:val="04A0"/>
+      </w:tblPr>
+      <w:tblGrid>
+        <w:gridCol w:w="9936"/>
+      </w:tblGrid>
+      <w:tr>
+        <w:tc>
+          <w:tcPr>
+            <w:tcW w:type="dxa" w:w="9360"/>
+            <w:vAlign w:val="center"/>
+            <w:shd w:fill="F3F6FA"/>
+            <w:tcBorders>
+              <w:top w:val="single" w:sz="4" w:color="D9E2F3"/>
+              <w:left w:val="single" w:sz="4" w:color="D9E2F3"/>
+              <w:bottom w:val="single" w:sz="4" w:color="D9E2F3"/>
+              <w:right w:val="single" w:sz="4" w:color="D9E2F3"/>
+            </w:tcBorders>
+          </w:tcPr>
+          <w:p>
+            <w:pPr>
+              <w:spacing w:before="60" w:after="60"/>
+            </w:pPr>
+            <w:r>
+              <w:rPr>
+                <w:rFonts w:ascii="Consolas" w:hAnsi="Consolas"/>
                 <w:sz w:val="18"/>
               </w:rPr>
               <w:t>{</w:t>
               <w:br/>
+              <w:t xml:space="preserve">  "habit_id": 1,</w:t>
+              <w:br/>
+              <w:t xml:space="preserve">  "habit_name": "Drink More Water",</w:t>
+              <w:br/>
+              <w:t xml:space="preserve">  "current_streak": 1,</w:t>
+              <w:br/>
+              <w:t xml:space="preserve">  "total_logs": 1</w:t>
+              <w:br/>
+              <w:t>}</w:t>
             </w:r>
+          </w:p>
+        </w:tc>
+      </w:tr>
+    </w:tbl>
+    <w:p>
+      <w:pPr>
+        <w:pStyle w:val="Heading3"/>
+      </w:pPr>
+      <w:r>
+        <w:t>Possible error responses:</w:t>
+      </w:r>
+    </w:p>
+    <w:tbl>
+      <w:tblPr>
+        <w:tblW w:type="auto" w:w="0"/>
+        <w:jc w:val="center"/>
+        <w:tblLayout w:type="fixed"/>
+        <w:tblLook w:firstColumn="1" w:firstRow="1" w:lastColumn="0" w:lastRow="0" w:noHBand="0" w:noVBand="1" w:val="04A0"/>
+      </w:tblPr>
+      <w:tblGrid>
+        <w:gridCol w:w="9936"/>
+      </w:tblGrid>
+      <w:tr>
+        <w:tc>
+          <w:tcPr>
+            <w:tcW w:type="dxa" w:w="9360"/>
+            <w:vAlign w:val="center"/>
+            <w:shd w:fill="F3F6FA"/>
+            <w:tcBorders>
+              <w:top w:val="single" w:sz="4" w:color="D9E2F3"/>
+              <w:left w:val="single" w:sz="4" w:color="D9E2F3"/>
+              <w:bottom w:val="single" w:sz="4" w:color="D9E2F3"/>
+              <w:right w:val="single" w:sz="4" w:color="D9E2F3"/>
+            </w:tcBorders>
+          </w:tcPr>
+          <w:p>
+            <w:pPr>
+              <w:spacing w:before="60" w:after="60"/>
+            </w:pPr>
             <w:r>
               <w:rPr>
-                <w:rFonts w:ascii="Courier New" w:hAnsi="Courier New"/>
+                <w:rFonts w:ascii="Consolas" w:hAnsi="Consolas"/>
                 <w:sz w:val="18"/>
               </w:rPr>
-              <w:t xml:space="preserve">  "total_habits": 1,</w:t>
+              <w:t>404 Not Found</w:t>
               <w:br/>
-            </w:r>
-            <w:r>
-              <w:rPr>
-                <w:rFonts w:ascii="Courier New" w:hAnsi="Courier New"/>
-                <w:sz w:val="18"/>
-              </w:rPr>
-              <w:t xml:space="preserve">  "daily_habits": 1,</w:t>
+              <w:t>{</w:t>
               <w:br/>
-            </w:r>
-            <w:r>
-              <w:rPr>
-                <w:rFonts w:ascii="Courier New" w:hAnsi="Courier New"/>
-                <w:sz w:val="18"/>
-              </w:rPr>
-              <w:t xml:space="preserve">  "weekly_habits": 0</w:t>
+              <w:t xml:space="preserve">  "error": "Habit not found"</w:t>
               <w:br/>
-            </w:r>
-            <w:r>
-              <w:rPr>
-                <w:rFonts w:ascii="Courier New" w:hAnsi="Courier New"/>
-                <w:sz w:val="18"/>
-              </w:rPr>
               <w:t>}</w:t>
             </w:r>
           </w:p>
@@ -1581,17 +2298,68 @@
         <w:pStyle w:val="Heading1"/>
       </w:pPr>
       <w:r>
-        <w:t>Notes</w:t>
+        <w:t>Tools Used</w:t>
       </w:r>
     </w:p>
     <w:p>
+      <w:pPr>
+        <w:pStyle w:val="ListBullet"/>
+      </w:pPr>
       <w:r>
-        <w:t>This document summarises the local development API used during implementation. For final submission, the same content can be exported to PDF and included alongside the public GitHub repository link.</w:t>
+        <w:t>Python</w:t>
+      </w:r>
+    </w:p>
+    <w:p>
+      <w:pPr>
+        <w:pStyle w:val="ListBullet"/>
+      </w:pPr>
+      <w:r>
+        <w:t>Django</w:t>
+      </w:r>
+    </w:p>
+    <w:p>
+      <w:pPr>
+        <w:pStyle w:val="ListBullet"/>
+      </w:pPr>
+      <w:r>
+        <w:t>SQLite</w:t>
+      </w:r>
+    </w:p>
+    <w:p>
+      <w:pPr>
+        <w:pStyle w:val="ListBullet"/>
+      </w:pPr>
+      <w:r>
+        <w:t>Git</w:t>
+      </w:r>
+    </w:p>
+    <w:p>
+      <w:pPr>
+        <w:pStyle w:val="ListBullet"/>
+      </w:pPr>
+      <w:r>
+        <w:t>GitHub</w:t>
+      </w:r>
+    </w:p>
+    <w:p>
+      <w:pPr>
+        <w:pStyle w:val="ListBullet"/>
+      </w:pPr>
+      <w:r>
+        <w:t>Postman</w:t>
+      </w:r>
+    </w:p>
+    <w:p>
+      <w:pPr>
+        <w:pStyle w:val="ListBullet"/>
+      </w:pPr>
+      <w:r>
+        <w:t>Django Test Framework</w:t>
       </w:r>
     </w:p>
     <w:sectPr>
       <w:pgSz w:w="12240" w:h="15840"/>
-      <w:pgMar w:top="1152" w:right="1296" w:bottom="1152" w:left="1296" w:header="720" w:footer="720" w:gutter="0"/>
+      <w:pgMar w:top="1008" w:right="1152" w:bottom="1008" w:left="1152" w:header="720" w:footer="720" w:gutter="0"/>
       <w:cols w:space="720"/>
       <w:docGrid w:linePitch="360"/>
     </w:sectPr>
@@ -2029,7 +2797,7 @@
       <w:rFonts w:asciiTheme="majorHAnsi" w:eastAsiaTheme="majorEastAsia" w:hAnsiTheme="majorHAnsi" w:cstheme="majorBidi" w:ascii="Aptos" w:hAnsi="Aptos"/>
       <w:b/>
       <w:bCs/>
-      <w:color w:val="365F91" w:themeColor="accent1" w:themeShade="BF"/>
+      <w:color w:val="1F4E79"/>
       <w:sz w:val="28"/>
       <w:szCs w:val="28"/>
     </w:rPr>
@@ -2053,8 +2821,8 @@
       <w:rFonts w:asciiTheme="majorHAnsi" w:eastAsiaTheme="majorEastAsia" w:hAnsiTheme="majorHAnsi" w:cstheme="majorBidi" w:ascii="Aptos" w:hAnsi="Aptos"/>
       <w:b/>
       <w:bCs/>
-      <w:color w:val="4F81BD" w:themeColor="accent1"/>
-      <w:sz w:val="26"/>
+      <w:color w:val="2F5496"/>
+      <w:sz w:val="23"/>
       <w:szCs w:val="26"/>
     </w:rPr>
   </w:style>
@@ -2074,10 +2842,11 @@
       <w:outlineLvl w:val="2"/>
     </w:pPr>
     <w:rPr>
-      <w:rFonts w:asciiTheme="majorHAnsi" w:eastAsiaTheme="majorEastAsia" w:hAnsiTheme="majorHAnsi" w:cstheme="majorBidi"/>
+      <w:rFonts w:asciiTheme="majorHAnsi" w:eastAsiaTheme="majorEastAsia" w:hAnsiTheme="majorHAnsi" w:cstheme="majorBidi" w:ascii="Aptos" w:hAnsi="Aptos"/>
       <w:b/>
       <w:bCs/>
-      <w:color w:val="4F81BD" w:themeColor="accent1"/>
+      <w:color w:val="4F6228"/>
+      <w:sz w:val="21"/>
     </w:rPr>
   </w:style>
   <w:style w:type="paragraph" w:styleId="Heading4">
@@ -2316,10 +3085,10 @@
     </w:pPr>
     <w:rPr>
       <w:rFonts w:asciiTheme="majorHAnsi" w:eastAsiaTheme="majorEastAsia" w:hAnsiTheme="majorHAnsi" w:cstheme="majorBidi" w:ascii="Aptos" w:hAnsi="Aptos"/>
-      <w:color w:val="17365D" w:themeColor="text2" w:themeShade="BF"/>
+      <w:color w:val="1F4E79"/>
       <w:spacing w:val="5"/>
       <w:kern w:val="28"/>
-      <w:sz w:val="52"/>
+      <w:sz w:val="40"/>
       <w:szCs w:val="52"/>
     </w:rPr>
   </w:style>

</xml_diff>